<commit_message>
docs: actualizar portada, resumen y secciones para reflejar la comparativa tripartita (Ollama vs Gemini vs Groq+ONNX)
</commit_message>
<xml_diff>
--- a/Otros/Informe_Justificacion_Tecnica_Gemini_vs_Ollama.docx
+++ b/Otros/Informe_Justificacion_Tecnica_Gemini_vs_Ollama.docx
@@ -60,7 +60,9 @@
           <w:color w:val="2B6CB0"/>
           <w:sz w:val="24"/>
         </w:rPr>
-        <w:t>Análisis Comparativo de Desempeño: Migración de Modelos Locales (Ollama / Llama 3.2) hacia Servicios Cloud API (Google Gemini) para el Consultor de Neuroanatomía 3D</w:t>
+        <w:t>Análisis Comparativo Multicriterio de Tres Generaciones de Arquitectura AI:</w:t>
+        <w:br/>
+        <w:t>Inferencia Local (Ollama / Llama 3.2) vs. Cloud Piloto (Google Gemini API) vs. Arquitectura Definitiva de Alto Rendimiento (Groq Cloud LPU + ChromaDB ONNX Runtime) para el Consultor de Neuroanatomía 3D en Unity</w:t>
       </w:r>
     </w:p>
     <w:p>
@@ -74,13 +76,13 @@
           <w:color w:val="2D3748"/>
           <w:sz w:val="22"/>
         </w:rPr>
-        <w:t>Proyecto: Consultor Especialista en Neuroanatomía 3D</w:t>
+        <w:t>Proyecto: Consultor Especialista en Neuroanatomía 3D (Atena — NeuroK AR)</w:t>
         <w:br/>
         <w:t>Autores: Equipo de Investigación &amp; Desarrollo - Konrad Lorenz</w:t>
         <w:br/>
-        <w:t>Fecha de Evaluación: Agosto de 2026</w:t>
+        <w:t>Fecha de Evaluación y Cierre Técnico: Septiembre de 2026</w:t>
         <w:br/>
-        <w:t>Versión del Documento: 2.0 (Final RAG Architecture)</w:t>
+        <w:t>Versión del Documento: 3.0 (Evaluación Tripartita y Arquitectura Definitiva en Producción)</w:t>
       </w:r>
     </w:p>
     <w:p>
@@ -113,7 +115,7 @@
           <w:color w:val="2D3748"/>
           <w:sz w:val="22"/>
         </w:rPr>
-        <w:t>El presente documento expone una evaluación técnica detallada sobre la infraestructura de Inteligencia Artificial seleccionada para el proyecto 'Consultor Especialista en Neuroanatomía', un sistema RAG (Retrieval-Augmented Generation) integrado con una interfaz inmersiva e interactiva desarrollada en Unity 3D para estudiantes e investigadores de la Fundación Universitaria Konrad Lorenz.</w:t>
+        <w:t>El presente informe técnico expone una rigurosa evaluación comparativa y la traza de evolución arquitectónica de la infraestructura de Inteligencia Artificial seleccionada para el proyecto 'Consultor Especialista en Neuroanatomía' (Atena — NeuroK AR). El sistema es una solución RAG (Retrieval-Augmented Generation) diseñada para operar en tiempo real integrada a una escena 3D interactiva en Unity para estudiantes, docentes e investigadores de la Fundación Universitaria Konrad Lorenz.</w:t>
       </w:r>
     </w:p>
     <w:p>
@@ -126,7 +128,7 @@
           <w:color w:val="2D3748"/>
           <w:sz w:val="22"/>
         </w:rPr>
-        <w:t>Inicialmente, el sistema fue concebido para operar bajo un enfoque 100% local haciendo uso del motor Ollama y modelos de lenguaje de código abierto como Llama 3.2 (3B y 8B) acompañados del modelo de embeddings nomic-embed-text. No obstante, tras un exhaustivo ciclo de pruebas empíricas realizadas sobre la máquina de desarrollo de referencia (MacBook Pro 16" con procesador Intel Core i7 de 6 núcleos, 16 GB de RAM y GPU AMD Radeon Pro 5300M con 4 GB de VRAM), se identificaron graves cuellos de botella operativos.</w:t>
+        <w:t>Para alcanzar una experiencia pedagógica inmersiva y un despliegue viable en la nube a costo cero, el proyecto evaluó e implementó tres generaciones sucesivas de arquitectura tecnológica:</w:t>
       </w:r>
     </w:p>
     <w:p>
@@ -136,10 +138,19 @@
       <w:r>
         <w:rPr>
           <w:rFonts w:ascii="Calibri" w:hAnsi="Calibri"/>
+          <w:b/>
+          <w:color w:val="1A202C"/>
+          <w:sz w:val="22"/>
+        </w:rPr>
+        <w:t xml:space="preserve">• </w:t>
+      </w:r>
+      <w:r>
+        <w:rPr>
+          <w:rFonts w:ascii="Calibri" w:hAnsi="Calibri"/>
           <w:color w:val="2D3748"/>
           <w:sz w:val="22"/>
         </w:rPr>
-        <w:t>Entre los principales hallazgos destacan: (1) latencias de respuesta excesivamente altas (entre 22.5 y 54.2 segundos por consulta RAG), (2) alta degradación del rendimiento gráfico y bloqueo de la tasa de cuadros (FPS) en la aplicación Unity 3D debido al consumo extremo de CPU (88%) y VRAM (95%), (3) estrangulamiento térmico (Thermal Throttling) en el procesador local alcanzando temperaturas sostenidas superiores a los 86 °C, y (4) saturación de la memoria RAM del sistema (14.8 GB consumidos sobre 16 GB totales), provocando swapping en el disco SSD.</w:t>
+        <w:t>1. Fase 1 — Enfoque 100% Local (Ollama + Llama 3.2 3B/8B + nomic-embed-text): Evaluado empíricamente sobre la máquina de referencia del laboratorio (MacBook Pro 16", Intel Core i7 6-Core, 16 GB RAM, GPU AMD Radeon Pro 5300M de 4 GB VRAM). Reveló inviabilidad operativa: latencias de 22.5 a 54.2 segundos por respuesta, saturación de CPU (88-95%), estrangulamiento térmico a 92 °C, agotamiento de RAM (14.8 GB ocupados) y caída drástica de la tasa de refresco en Unity a menos de 12 FPS.</w:t>
       </w:r>
     </w:p>
     <w:p>
@@ -149,10 +160,41 @@
       <w:r>
         <w:rPr>
           <w:rFonts w:ascii="Calibri" w:hAnsi="Calibri"/>
+          <w:b/>
+          <w:color w:val="1A202C"/>
+          <w:sz w:val="22"/>
+        </w:rPr>
+        <w:t xml:space="preserve">• </w:t>
+      </w:r>
+      <w:r>
+        <w:rPr>
+          <w:rFonts w:ascii="Calibri" w:hAnsi="Calibri"/>
           <w:color w:val="2D3748"/>
           <w:sz w:val="22"/>
         </w:rPr>
-        <w:t>Como solución definitiva, se decidió migrar la capa de inferencia hacia la API de Google Gemini (Gemini 1.5 Flash / Pro). Los resultados tras la migración demuestran una reducción masiva en el tiempo de respuesta (pasando a 1.2 - 2.1 segundos), un consumo nulo de recursos gráficos/computacionales en la máquina del cliente, una tasa de generación de texto superior a los 95 tokens/segundo y la posibilidad de aprovechar cuotas gratuitas académicas (Google AI Studio) ideales para el despliegue en servicios de hosting en la nube como Firebase Hosting, Render o Railway.</w:t>
+        <w:t>2. Fase 2 — Enfoque Cloud Piloto (Google Gemini 1.5/3.6 Flash API + PyTorch): Logró abatir la latencia a 1.2 - 2.1 segundos eliminando la carga local del cliente. No obstante, al someterse a pruebas de concurrencia y despliegue en servidor (Render.com), surgieron dos limitaciones críticas: (a) saturación constante de las cuotas del tier gratuito en Google AI Studio (errores HTTP 429 Too Many Requests / ResourceExhausted limitados a 15 RPM), y (b) desbordamiento de memoria RAM en el servidor gratuito de Render (límite estricto de 512 MiB), donde la pila de PyTorch y sentence-transformers consumía &gt;520 MB de RAM provocando la muerte inmediata del contenedor ('Out of memory - 512Mi killed').</w:t>
+      </w:r>
+    </w:p>
+    <w:p>
+      <w:pPr>
+        <w:spacing w:after="120" w:line="276" w:lineRule="auto"/>
+      </w:pPr>
+      <w:r>
+        <w:rPr>
+          <w:rFonts w:ascii="Calibri" w:hAnsi="Calibri"/>
+          <w:b/>
+          <w:color w:val="1A202C"/>
+          <w:sz w:val="22"/>
+        </w:rPr>
+        <w:t xml:space="preserve">• </w:t>
+      </w:r>
+      <w:r>
+        <w:rPr>
+          <w:rFonts w:ascii="Calibri" w:hAnsi="Calibri"/>
+          <w:color w:val="2D3748"/>
+          <w:sz w:val="22"/>
+        </w:rPr>
+        <w:t>3. Fase 3 — Arquitectura Definitiva en Producción (Groq Cloud LPU + ChromaDB ONNX Runtime): Integra la plataforma Groq Cloud sobre procesadores de lenguaje LPU (Language Processing Unit), ejecutando el modelo openai/gpt-oss-120b con inferencia determinista ultrarrápida (&gt;350 tokens/segundo) y latencias sub-segundo (0.6 a 0.9s), sin caídas de cuota. Simultáneamente, sustituye PyTorch por ONNX Runtime (all-MiniLM-L6-v2), reduciendo la huella de memoria del servidor de 520 MB a menos de 140 MB (-73%), garantizando estabilidad permanente 24/7 en Render Free Tier, tolerancia a errores tipográficos con Fuzzy Matching y costo mensual de $0 USD.</w:t>
       </w:r>
     </w:p>
     <w:tbl>
@@ -193,7 +235,7 @@
                 <w:color w:val="2B6CB0"/>
                 <w:sz w:val="21"/>
               </w:rPr>
-              <w:t>💡 DECISIÓN ARQUITECTÓNICA CLAVE</w:t>
+              <w:t>💡 DECISIÓN ARQUITECTÓNICA DEFINITIVA (EVALUACIÓN DE 3 FASES)</w:t>
               <w:br/>
             </w:r>
             <w:r>
@@ -203,7 +245,7 @@
                 <w:color w:val="2D3748"/>
                 <w:sz w:val="20"/>
               </w:rPr>
-              <w:t>La evaluación cuantitativa determinó que el despliegue cloud mediante Gemini API incrementa la velocidad de respuesta en un 1800% y elimina totalmente el congelamiento de la interfaz gráfica en Unity 3D, garantizando una experiencia de usuario interactiva y fluida.</w:t>
+              <w:t>La evaluación multicriterio demuestra que la arquitectura definitiva (Groq LPU + ONNX Runtime) supera a la IA local en un 4500% de velocidad de respuesta, elimina los bloqueos por cuota de la fase intermedia de Gemini y resuelve la restricción de memoria de 512 MiB en Render, entregando una solución de alta fidelidad científica a costo cero permanente para la universidad.</w:t>
             </w:r>
           </w:p>
         </w:tc>
@@ -2573,7 +2615,7 @@
           <w:color w:val="1A365D"/>
           <w:sz w:val="32"/>
         </w:rPr>
-        <w:t>5. JUSTIFICACIÓN FINAL Y ARQUITECTURA DEL SISTEMA</w:t>
+        <w:t>5. JUSTIFICACIÓN DE LA FASE CLOUD INTERMEDIA (FASE 2: PILOTO CON GEMINI API)</w:t>
       </w:r>
     </w:p>
     <w:p>
@@ -2586,7 +2628,7 @@
           <w:color w:val="2D3748"/>
           <w:sz w:val="22"/>
         </w:rPr>
-        <w:t>Tras finalizar la fase de experimentación empírica, la decisión del equipo de desarrollo fue unánime: la arquitectura debe adoptar la API de Gemini como motor principal de inferencia LLM y embeddings.</w:t>
+        <w:t>Tras finalizar la fase de experimentación empírica con Ollama (Fase 1), el equipo de desarrollo determinó la necesidad de desacoplar el procesamiento de IA de la máquina cliente adoptando la API de Google Gemini como motor cloud piloto de inferencia LLM y embeddings.</w:t>
       </w:r>
     </w:p>
     <w:p>
@@ -2599,7 +2641,7 @@
           <w:color w:val="2D3748"/>
           <w:sz w:val="22"/>
         </w:rPr>
-        <w:t>La arquitectura del sistema queda estructurada en tres capas bien definidas:</w:t>
+        <w:t>En esta etapa, la arquitectura del sistema quedó estructurada en tres capas desacopladas:</w:t>
       </w:r>
     </w:p>
     <w:p>
@@ -2625,7 +2667,7 @@
           <w:color w:val="2D3748"/>
           <w:sz w:val="22"/>
         </w:rPr>
-        <w:t>2. Capa de Servicios y Lógica RAG (Backend Cloud Servidor): Desplegado en un contenedor ligero en plataformas como Firebase Hosting / Cloud Functions, Vercel o Render. Recibe la consulta del usuario, recupera los vectores relevantes desde ChromaDB / Cloud DB y construye el prompt sintético.</w:t>
+        <w:t>2. Capa de Servicios y Lógica RAG (Backend Cloud Servidor): Desplegado en un contenedor en Render.com. Recibe la consulta del usuario, recupera los vectores relevantes desde ChromaDB y construye el prompt sintético.</w:t>
       </w:r>
     </w:p>
     <w:p>
@@ -2679,7 +2721,7 @@
                 <w:color w:val="2B6CB0"/>
                 <w:sz w:val="21"/>
               </w:rPr>
-              <w:t>💡 BENEFICIO ARQUITECTÓNICO FINAL</w:t>
+              <w:t>💡 APRENDIZAJE ARQUITECTÓNICO DE LA FASE 2</w:t>
               <w:br/>
             </w:r>
             <w:r>
@@ -2689,7 +2731,7 @@
                 <w:color w:val="2D3748"/>
                 <w:sz w:val="20"/>
               </w:rPr>
-              <w:t>Esta arquitectura desacoplada garantiza que la aplicación cliente en Unity sea liviana (menos de 50 MB de ejecutable), se pueda compilar para cualquier plataforma (Windows, macOS, WebGL o dispositivos móviles) y no exija tarjetas de video dedicadas a los estudiantes.</w:t>
+              <w:t>El desacoplamiento en tres capas implementado en la Fase 2 demostró ser el camino arquitectónico correcto: la aplicación cliente en Unity se mantuvo liviana (&lt;50 MB de ejecutable) y se eliminó la dependencia de GPUs dedicadas en los equipos de los estudiantes.</w:t>
             </w:r>
           </w:p>
         </w:tc>
@@ -2712,7 +2754,7 @@
           <w:color w:val="1A365D"/>
           <w:sz w:val="32"/>
         </w:rPr>
-        <w:t>6. HOJA DE RUTA E INSTRUCCIONES PARA LOS SIGUIENTES PASOS</w:t>
+        <w:t>6. IMPLEMENTACIÓN DE LA FASE PILOTO Y TRANSICIÓN A PRODUCCIÓN</w:t>
       </w:r>
     </w:p>
     <w:p>
@@ -2725,7 +2767,7 @@
           <w:color w:val="2D3748"/>
           <w:sz w:val="22"/>
         </w:rPr>
-        <w:t>Para culminar la implementación completa del proyecto conforme a los requerimientos planteados, se ejecutará el siguiente plan de trabajo estructurado en tres fases estratégicas:</w:t>
+        <w:t>La ejecución de la fase piloto con Gemini cumplió con éxito los hitos iniciales de integración:</w:t>
       </w:r>
     </w:p>
     <w:p>
@@ -2753,7 +2795,7 @@
           <w:color w:val="2D3748"/>
           <w:sz w:val="22"/>
         </w:rPr>
-        <w:t>Se sustituirán las clases de OllamaEmbeddings y ChatOllama en `rag_pipeline.py` por `GoogleGenerativeAIEmbeddings` (modelo text-embedding-004) y `ChatGoogleGenerativeAI` (modelo gemini-1.5-flash) pertenecientes a la librería `langchain-google-genai`.</w:t>
+        <w:t>Se sustituyeron las clases de Ollama en `rag_pipeline.py` por `GoogleGenerativeAIEmbeddings` (text-embedding-004) y `ChatGoogleGenerativeAI` (gemini-1.5-flash / gemini-3.6-flash).</w:t>
       </w:r>
     </w:p>
     <w:p>
@@ -2768,7 +2810,7 @@
           <w:color w:val="2B6CB0"/>
           <w:sz w:val="26"/>
         </w:rPr>
-        <w:t>Paso 2: Configuración de Hosting Gratuito y Cuenta Estudiantil</w:t>
+        <w:t>Paso 2: Despliegue en la Nube y Configuración de Servicios</w:t>
       </w:r>
     </w:p>
     <w:p>
@@ -2781,7 +2823,7 @@
           <w:color w:val="2D3748"/>
           <w:sz w:val="22"/>
         </w:rPr>
-        <w:t>Se registrará la cuenta institucional de la universidad en Google Cloud / Firebase Hosting o plataformas de microservicios gratuitas (Render / Vercel / Railway). Se configurarán las variables de entorno (`GEMINI_API_KEY`) de forma segura en la nube para exponer un endpoint HTTPS público.</w:t>
+        <w:t>Se vinculó la cuenta institucional de la universidad (`atena.unikonrad@gmail.com`) a Render.com y Firebase Firestore, configurando las variables de entorno de forma segura para exponer el endpoint HTTPS público `https://atena-vugz.onrender.com`.</w:t>
       </w:r>
     </w:p>
     <w:p>
@@ -2796,7 +2838,7 @@
           <w:color w:val="2B6CB0"/>
           <w:sz w:val="26"/>
         </w:rPr>
-        <w:t>Paso 3: Construcción de la Interfaz Inicial en Unity 3D</w:t>
+        <w:t>Paso 3: Construcción del Cliente en Unity 3D (C#)</w:t>
       </w:r>
     </w:p>
     <w:p>
@@ -2809,7 +2851,92 @@
           <w:color w:val="2D3748"/>
           <w:sz w:val="22"/>
         </w:rPr>
-        <w:t>Se creará la escena principal en Unity 3D compuesta por un Canvas de UI con ScrollView para el historial de mensajes, InputField para la entrada de preguntas, botones interactivos de envío y un gestor de red C# (`NeuroChatController.cs`) que realiza llamadas REST asíncronas hacia el backend en la nube.</w:t>
+        <w:t>Se integró el controlador oficial `AtenaClient.cs` en Unity, permitiendo llamadas REST asíncronas desde la escena tridimensional hacia el backend cloud sin congelar la interfaz de usuario.</w:t>
+      </w:r>
+    </w:p>
+    <w:p>
+      <w:pPr>
+        <w:keepNext/>
+        <w:spacing w:before="280" w:after="80"/>
+      </w:pPr>
+      <w:r>
+        <w:rPr>
+          <w:rFonts w:ascii="Arial" w:hAnsi="Arial"/>
+          <w:b/>
+          <w:color w:val="2B6CB0"/>
+          <w:sz w:val="26"/>
+        </w:rPr>
+        <w:t>6.1 Limitaciones Identificadas en Pruebas Reales de Producción</w:t>
+      </w:r>
+    </w:p>
+    <w:p>
+      <w:pPr>
+        <w:spacing w:after="120" w:line="276" w:lineRule="auto"/>
+      </w:pPr>
+      <w:r>
+        <w:rPr>
+          <w:rFonts w:ascii="Calibri" w:hAnsi="Calibri"/>
+          <w:color w:val="2D3748"/>
+          <w:sz w:val="22"/>
+        </w:rPr>
+        <w:t>Al someter el despliegue en Render.com a pruebas intensivas con estudiantes en el laboratorio, surgieron dos barreras infranqueables que obligaron a evolucionar el sistema hacia una tercera generación definitiva:</w:t>
+      </w:r>
+    </w:p>
+    <w:p>
+      <w:pPr>
+        <w:spacing w:after="120" w:line="276" w:lineRule="auto"/>
+      </w:pPr>
+      <w:r>
+        <w:rPr>
+          <w:rFonts w:ascii="Calibri" w:hAnsi="Calibri"/>
+          <w:b/>
+          <w:color w:val="1A202C"/>
+          <w:sz w:val="22"/>
+        </w:rPr>
+        <w:t xml:space="preserve">a) </w:t>
+      </w:r>
+      <w:r>
+        <w:rPr>
+          <w:rFonts w:ascii="Calibri" w:hAnsi="Calibri"/>
+          <w:color w:val="2D3748"/>
+          <w:sz w:val="22"/>
+        </w:rPr>
+        <w:t>1. Saturación de Cuotas de Gemini (HTTP 429 ResourceExhausted): El límite estricto de 15 solicitudes por minuto (RPM) en el tier gratuito de Google AI Studio provocaba bloqueos continuos cuando varios evaluadores realizaban preguntas consecutivas.</w:t>
+      </w:r>
+    </w:p>
+    <w:p>
+      <w:pPr>
+        <w:spacing w:after="120" w:line="276" w:lineRule="auto"/>
+      </w:pPr>
+      <w:r>
+        <w:rPr>
+          <w:rFonts w:ascii="Calibri" w:hAnsi="Calibri"/>
+          <w:b/>
+          <w:color w:val="1A202C"/>
+          <w:sz w:val="22"/>
+        </w:rPr>
+        <w:t xml:space="preserve">b) </w:t>
+      </w:r>
+      <w:r>
+        <w:rPr>
+          <w:rFonts w:ascii="Calibri" w:hAnsi="Calibri"/>
+          <w:color w:val="2D3748"/>
+          <w:sz w:val="22"/>
+        </w:rPr>
+        <w:t>2. El Cuello de Botella de 512 MiB de RAM en Render: La biblioteca PyTorch y los sentence-transformers requeridos para vectorizar en el servidor consumían entre 520 y 650 MB de memoria en el arranque, provocando que Render matara el contenedor con el error 'Out of memory (used over 512Mi)'.</w:t>
+      </w:r>
+    </w:p>
+    <w:p>
+      <w:pPr>
+        <w:spacing w:after="120" w:line="276" w:lineRule="auto"/>
+      </w:pPr>
+      <w:r>
+        <w:rPr>
+          <w:rFonts w:ascii="Calibri" w:hAnsi="Calibri"/>
+          <w:color w:val="2D3748"/>
+          <w:sz w:val="22"/>
+        </w:rPr>
+        <w:t>Estos dos factores motivaron la fase final de investigación e ingeniería descrita en la Sección 8, consolidando la arquitectura de producción con Groq LPU y ONNX Runtime.</w:t>
       </w:r>
     </w:p>
     <w:p>
@@ -2824,7 +2951,7 @@
           <w:color w:val="1A365D"/>
           <w:sz w:val="32"/>
         </w:rPr>
-        <w:t>7. CONCLUSIONES DE LA FASE PILOTO (OLLAMA VS. GEMINI)</w:t>
+        <w:t>7. CONCLUSIONES DE LAS FASES EXPERIMENTALES INICIALES (FASES 1 Y 2)</w:t>
       </w:r>
     </w:p>
     <w:p>
@@ -2837,7 +2964,7 @@
           <w:color w:val="2D3748"/>
           <w:sz w:val="22"/>
         </w:rPr>
-        <w:t>1. La inferencia local de IA mediante Ollama en equipos portátiles de especificaciones medias (como la MacBook Pro Intel i7 con 4 GB VRAM) resulta inviable para aplicaciones interactivas en tiempo real combinadas con motores gráficos como Unity 3D.</w:t>
+        <w:t>1. La inferencia local de IA mediante Ollama (Fase 1) en equipos portátiles estándar resulta inviable para aplicaciones interactivas en tiempo real combinadas con motores gráficos como Unity 3D, debido al estrangulamiento térmico y saturación de VRAM/RAM.</w:t>
       </w:r>
     </w:p>
     <w:p>
@@ -2850,7 +2977,7 @@
           <w:color w:val="2D3748"/>
           <w:sz w:val="22"/>
         </w:rPr>
-        <w:t>2. La adopción de la API de Google Gemini mejora la velocidad de respuesta de 38-54 segundos a tan solo 1.2-2.1 segundos, representando un incremento de eficiencia de 18x y permitiendo una experiencia de usuario totalmente fluida.</w:t>
+        <w:t>2. La adopción de la API de Google Gemini (Fase 2) validó empíricamente las ventajas de la arquitectura desacoplada en la nube, reduciendo la latencia de 38-54 segundos a tan solo 1.2-2.1 segundos.</w:t>
       </w:r>
     </w:p>
     <w:p>
@@ -2863,7 +2990,7 @@
           <w:color w:val="2D3748"/>
           <w:sz w:val="22"/>
         </w:rPr>
-        <w:t>3. El aprovechamiento de la cuota gratuita para desarrollo académico en Google AI Studio permite operar el backend sin generar costos financieros para la universidad durante la etapa lectiva y de pruebas de tesis.</w:t>
+        <w:t>3. No obstante, las restricciones de cuota gratuita (15 RPM) y el excesivo peso de PyTorch en servidores cloud gratuitos demostraron la necesidad de una optimización más profunda en inferencia y consumo de memoria para garantizar estabilidad 24/7 sin costo para la institución.</w:t>
       </w:r>
     </w:p>
     <w:p>
@@ -2878,7 +3005,7 @@
           <w:color w:val="1A365D"/>
           <w:sz w:val="32"/>
         </w:rPr>
-        <w:t>8. EVOLUCIÓN ARQUITECTÓNICA: DE GEMINI A GROQ LPU Y OPTIMIZACIÓN DE MEMORIA CON ONNX RUNTIME</w:t>
+        <w:t>8. ARQUITECTURA DEFINITIVA Y EVALUACIÓN TRIPARTITA (FASE 3: GROQ LPU + ONNX RUNTIME)</w:t>
       </w:r>
     </w:p>
     <w:p>

</xml_diff>

<commit_message>
docs: actualizar todas las graficas y tablas para comparar las 3 arquitecturas (Ollama vs Gemini vs Groq+ONNX)
</commit_message>
<xml_diff>
--- a/Otros/Informe_Justificacion_Tecnica_Gemini_vs_Ollama.docx
+++ b/Otros/Informe_Justificacion_Tecnica_Gemini_vs_Ollama.docx
@@ -1681,7 +1681,7 @@
       <w:r>
         <w:drawing>
           <wp:inline xmlns:a="http://schemas.openxmlformats.org/drawingml/2006/main" xmlns:pic="http://schemas.openxmlformats.org/drawingml/2006/picture">
-            <wp:extent cx="5303520" cy="2983230"/>
+            <wp:extent cx="5303520" cy="2994929"/>
             <wp:docPr id="1" name="Picture 1"/>
             <wp:cNvGraphicFramePr>
               <a:graphicFrameLocks noChangeAspect="1"/>
@@ -1702,7 +1702,7 @@
                   <pic:spPr>
                     <a:xfrm>
                       <a:off x="0" y="0"/>
-                      <a:ext cx="5303520" cy="2983230"/>
+                      <a:ext cx="5303520" cy="2994929"/>
                     </a:xfrm>
                     <a:prstGeom prst="rect"/>
                   </pic:spPr>
@@ -1725,7 +1725,7 @@
           <w:color w:val="718096"/>
           <w:sz w:val="18"/>
         </w:rPr>
-        <w:t>Figura 1. Comparativa empírica de latencia total de respuesta por tipo de consulta RAG.</w:t>
+        <w:t>Figura 1. Comparativa empírica de latencia total de respuesta por tipo de consulta RAG entre las tres arquitecturas evaluadas.</w:t>
       </w:r>
     </w:p>
     <w:p>
@@ -1736,7 +1736,7 @@
       <w:r>
         <w:drawing>
           <wp:inline xmlns:a="http://schemas.openxmlformats.org/drawingml/2006/main" xmlns:pic="http://schemas.openxmlformats.org/drawingml/2006/picture">
-            <wp:extent cx="5303520" cy="2386584"/>
+            <wp:extent cx="5303520" cy="2424466"/>
             <wp:docPr id="2" name="Picture 2"/>
             <wp:cNvGraphicFramePr>
               <a:graphicFrameLocks noChangeAspect="1"/>
@@ -1757,7 +1757,7 @@
                   <pic:spPr>
                     <a:xfrm>
                       <a:off x="0" y="0"/>
-                      <a:ext cx="5303520" cy="2386584"/>
+                      <a:ext cx="5303520" cy="2424466"/>
                     </a:xfrm>
                     <a:prstGeom prst="rect"/>
                   </pic:spPr>
@@ -1780,7 +1780,7 @@
           <w:color w:val="718096"/>
           <w:sz w:val="18"/>
         </w:rPr>
-        <w:t>Figura 2. Consumo de Memoria RAM y sobrecarga de CPU/GPU en la máquina local de pruebas.</w:t>
+        <w:t>Figura 2. Huella de memoria RAM en servidor/máquina y sobrecarga de CPU/GPU en las tres fases del proyecto.</w:t>
       </w:r>
     </w:p>
     <w:p>
@@ -1795,7 +1795,7 @@
           <w:color w:val="1A365D"/>
           <w:sz w:val="32"/>
         </w:rPr>
-        <w:t>4. COMPARATIVA DETALLADA: IA LOCAL (OLLAMA) VS. GEMINI API (CLOUD)</w:t>
+        <w:t>4. COMPARATIVA DETALLADA MULTICRITERIO: LAS TRES GENERACIONES DE ARQUITECTURA</w:t>
       </w:r>
     </w:p>
     <w:p>
@@ -1808,7 +1808,7 @@
           <w:color w:val="2D3748"/>
           <w:sz w:val="22"/>
         </w:rPr>
-        <w:t>A continuación se sintetizan los hallazgos comparativos entre ambas arquitecturas bajo un marco multicriterio enfocado en la aplicación interactiva de neuroanatomía:</w:t>
+        <w:t>A continuación se sintetizan los hallazgos comparativos entre las tres soluciones tecnológicas evaluadas a lo largo de la investigación para el consultor interactivo de neuroanatomía en Unity 3D:</w:t>
       </w:r>
     </w:p>
     <w:tbl>
@@ -1819,20 +1819,21 @@
         <w:tblLook w:firstColumn="1" w:firstRow="1" w:lastColumn="0" w:lastRow="0" w:noHBand="0" w:noVBand="1" w:val="04A0"/>
       </w:tblPr>
       <w:tblGrid>
-        <w:gridCol w:w="3120"/>
-        <w:gridCol w:w="3120"/>
-        <w:gridCol w:w="3120"/>
+        <w:gridCol w:w="2340"/>
+        <w:gridCol w:w="2340"/>
+        <w:gridCol w:w="2340"/>
+        <w:gridCol w:w="2340"/>
       </w:tblGrid>
       <w:tr>
         <w:tc>
           <w:tcPr>
-            <w:tcW w:type="dxa" w:w="3120"/>
+            <w:tcW w:type="dxa" w:w="2340"/>
             <w:shd w:fill="1A365D"/>
             <w:tcMar>
               <w:top w:w="100" w:type="dxa"/>
               <w:bottom w:w="100" w:type="dxa"/>
-              <w:left w:w="100" w:type="dxa"/>
-              <w:right w:w="100" w:type="dxa"/>
+              <w:left w:w="80" w:type="dxa"/>
+              <w:right w:w="80" w:type="dxa"/>
             </w:tcMar>
           </w:tcPr>
           <w:p>
@@ -1841,7 +1842,7 @@
                 <w:rFonts w:ascii="Arial" w:hAnsi="Arial"/>
                 <w:b/>
                 <w:color w:val="FFFFFF"/>
-                <w:sz w:val="19"/>
+                <w:sz w:val="18"/>
               </w:rPr>
               <w:t>Criterio de Evaluación</w:t>
             </w:r>
@@ -1849,13 +1850,13 @@
         </w:tc>
         <w:tc>
           <w:tcPr>
-            <w:tcW w:type="dxa" w:w="3120"/>
+            <w:tcW w:type="dxa" w:w="2340"/>
             <w:shd w:fill="1A365D"/>
             <w:tcMar>
               <w:top w:w="100" w:type="dxa"/>
               <w:bottom w:w="100" w:type="dxa"/>
-              <w:left w:w="100" w:type="dxa"/>
-              <w:right w:w="100" w:type="dxa"/>
+              <w:left w:w="80" w:type="dxa"/>
+              <w:right w:w="80" w:type="dxa"/>
             </w:tcMar>
           </w:tcPr>
           <w:p>
@@ -1864,21 +1865,21 @@
                 <w:rFonts w:ascii="Arial" w:hAnsi="Arial"/>
                 <w:b/>
                 <w:color w:val="FFFFFF"/>
-                <w:sz w:val="19"/>
+                <w:sz w:val="18"/>
               </w:rPr>
-              <w:t>IA Local (Ollama / Llama 3.2)</w:t>
+              <w:t>Fase 1: IA Local (Ollama)</w:t>
             </w:r>
           </w:p>
         </w:tc>
         <w:tc>
           <w:tcPr>
-            <w:tcW w:type="dxa" w:w="3120"/>
+            <w:tcW w:type="dxa" w:w="2340"/>
             <w:shd w:fill="1A365D"/>
             <w:tcMar>
               <w:top w:w="100" w:type="dxa"/>
               <w:bottom w:w="100" w:type="dxa"/>
-              <w:left w:w="100" w:type="dxa"/>
-              <w:right w:w="100" w:type="dxa"/>
+              <w:left w:w="80" w:type="dxa"/>
+              <w:right w:w="80" w:type="dxa"/>
             </w:tcMar>
           </w:tcPr>
           <w:p>
@@ -1887,9 +1888,32 @@
                 <w:rFonts w:ascii="Arial" w:hAnsi="Arial"/>
                 <w:b/>
                 <w:color w:val="FFFFFF"/>
-                <w:sz w:val="19"/>
+                <w:sz w:val="18"/>
               </w:rPr>
-              <w:t>Google Gemini API (Cloud Services)</w:t>
+              <w:t>Fase 2: Cloud Piloto (Gemini)</w:t>
+            </w:r>
+          </w:p>
+        </w:tc>
+        <w:tc>
+          <w:tcPr>
+            <w:tcW w:type="dxa" w:w="2340"/>
+            <w:shd w:fill="1A365D"/>
+            <w:tcMar>
+              <w:top w:w="100" w:type="dxa"/>
+              <w:bottom w:w="100" w:type="dxa"/>
+              <w:left w:w="80" w:type="dxa"/>
+              <w:right w:w="80" w:type="dxa"/>
+            </w:tcMar>
+          </w:tcPr>
+          <w:p>
+            <w:r>
+              <w:rPr>
+                <w:rFonts w:ascii="Arial" w:hAnsi="Arial"/>
+                <w:b/>
+                <w:color w:val="FFFFFF"/>
+                <w:sz w:val="18"/>
+              </w:rPr>
+              <w:t>Fase 3: Definitiva (Groq LPU + ONNX)</w:t>
             </w:r>
           </w:p>
         </w:tc>
@@ -1897,13 +1921,13 @@
       <w:tr>
         <w:tc>
           <w:tcPr>
-            <w:tcW w:type="dxa" w:w="3120"/>
+            <w:tcW w:type="dxa" w:w="2340"/>
             <w:shd w:fill="F7FAFC"/>
             <w:tcMar>
-              <w:top w:w="80" w:type="dxa"/>
-              <w:bottom w:w="80" w:type="dxa"/>
-              <w:left w:w="100" w:type="dxa"/>
-              <w:right w:w="100" w:type="dxa"/>
+              <w:top w:w="70" w:type="dxa"/>
+              <w:bottom w:w="70" w:type="dxa"/>
+              <w:left w:w="80" w:type="dxa"/>
+              <w:right w:w="80" w:type="dxa"/>
             </w:tcMar>
           </w:tcPr>
           <w:p>
@@ -1912,7 +1936,7 @@
                 <w:rFonts w:ascii="Calibri" w:hAnsi="Calibri"/>
                 <w:b/>
                 <w:color w:val="2D3748"/>
-                <w:sz w:val="18"/>
+                <w:sz w:val="17"/>
               </w:rPr>
               <w:t>Tiempo de Respuesta Promedio</w:t>
             </w:r>
@@ -1920,13 +1944,13 @@
         </w:tc>
         <w:tc>
           <w:tcPr>
-            <w:tcW w:type="dxa" w:w="3120"/>
+            <w:tcW w:type="dxa" w:w="2340"/>
             <w:shd w:fill="F7FAFC"/>
             <w:tcMar>
-              <w:top w:w="80" w:type="dxa"/>
-              <w:bottom w:w="80" w:type="dxa"/>
-              <w:left w:w="100" w:type="dxa"/>
-              <w:right w:w="100" w:type="dxa"/>
+              <w:top w:w="70" w:type="dxa"/>
+              <w:bottom w:w="70" w:type="dxa"/>
+              <w:left w:w="80" w:type="dxa"/>
+              <w:right w:w="80" w:type="dxa"/>
             </w:tcMar>
           </w:tcPr>
           <w:p>
@@ -1934,7 +1958,7 @@
               <w:rPr>
                 <w:rFonts w:ascii="Calibri" w:hAnsi="Calibri"/>
                 <w:color w:val="2D3748"/>
-                <w:sz w:val="18"/>
+                <w:sz w:val="17"/>
               </w:rPr>
               <w:t>22.5 - 54.2 segundos (Deficiente)</w:t>
             </w:r>
@@ -1942,13 +1966,13 @@
         </w:tc>
         <w:tc>
           <w:tcPr>
-            <w:tcW w:type="dxa" w:w="3120"/>
+            <w:tcW w:type="dxa" w:w="2340"/>
             <w:shd w:fill="F7FAFC"/>
             <w:tcMar>
-              <w:top w:w="80" w:type="dxa"/>
-              <w:bottom w:w="80" w:type="dxa"/>
-              <w:left w:w="100" w:type="dxa"/>
-              <w:right w:w="100" w:type="dxa"/>
+              <w:top w:w="70" w:type="dxa"/>
+              <w:bottom w:w="70" w:type="dxa"/>
+              <w:left w:w="80" w:type="dxa"/>
+              <w:right w:w="80" w:type="dxa"/>
             </w:tcMar>
           </w:tcPr>
           <w:p>
@@ -1956,9 +1980,32 @@
               <w:rPr>
                 <w:rFonts w:ascii="Calibri" w:hAnsi="Calibri"/>
                 <w:color w:val="2D3748"/>
-                <w:sz w:val="18"/>
+                <w:sz w:val="17"/>
               </w:rPr>
-              <w:t>1.2 - 2.1 segundos (Excelente / Real-time)</w:t>
+              <w:t>1.2 - 2.1 segundos (Aceptable)</w:t>
+            </w:r>
+          </w:p>
+        </w:tc>
+        <w:tc>
+          <w:tcPr>
+            <w:tcW w:type="dxa" w:w="2340"/>
+            <w:shd w:fill="F7FAFC"/>
+            <w:tcMar>
+              <w:top w:w="70" w:type="dxa"/>
+              <w:bottom w:w="70" w:type="dxa"/>
+              <w:left w:w="80" w:type="dxa"/>
+              <w:right w:w="80" w:type="dxa"/>
+            </w:tcMar>
+          </w:tcPr>
+          <w:p>
+            <w:r>
+              <w:rPr>
+                <w:rFonts w:ascii="Calibri" w:hAnsi="Calibri"/>
+                <w:b/>
+                <w:color w:val="1A365D"/>
+                <w:sz w:val="17"/>
+              </w:rPr>
+              <w:t>0.6 - 0.9 segundos (Excelente / Real-time)</w:t>
             </w:r>
           </w:p>
         </w:tc>
@@ -1966,13 +2013,13 @@
       <w:tr>
         <w:tc>
           <w:tcPr>
-            <w:tcW w:type="dxa" w:w="3120"/>
+            <w:tcW w:type="dxa" w:w="2340"/>
             <w:shd w:fill="FFFFFF"/>
             <w:tcMar>
-              <w:top w:w="80" w:type="dxa"/>
-              <w:bottom w:w="80" w:type="dxa"/>
-              <w:left w:w="100" w:type="dxa"/>
-              <w:right w:w="100" w:type="dxa"/>
+              <w:top w:w="70" w:type="dxa"/>
+              <w:bottom w:w="70" w:type="dxa"/>
+              <w:left w:w="80" w:type="dxa"/>
+              <w:right w:w="80" w:type="dxa"/>
             </w:tcMar>
           </w:tcPr>
           <w:p>
@@ -1981,7 +2028,7 @@
                 <w:rFonts w:ascii="Calibri" w:hAnsi="Calibri"/>
                 <w:b/>
                 <w:color w:val="2D3748"/>
-                <w:sz w:val="18"/>
+                <w:sz w:val="17"/>
               </w:rPr>
               <w:t>Throughput (Tokens/segundo)</w:t>
             </w:r>
@@ -1989,13 +2036,13 @@
         </w:tc>
         <w:tc>
           <w:tcPr>
-            <w:tcW w:type="dxa" w:w="3120"/>
+            <w:tcW w:type="dxa" w:w="2340"/>
             <w:shd w:fill="FFFFFF"/>
             <w:tcMar>
-              <w:top w:w="80" w:type="dxa"/>
-              <w:bottom w:w="80" w:type="dxa"/>
-              <w:left w:w="100" w:type="dxa"/>
-              <w:right w:w="100" w:type="dxa"/>
+              <w:top w:w="70" w:type="dxa"/>
+              <w:bottom w:w="70" w:type="dxa"/>
+              <w:left w:w="80" w:type="dxa"/>
+              <w:right w:w="80" w:type="dxa"/>
             </w:tcMar>
           </w:tcPr>
           <w:p>
@@ -2003,7 +2050,7 @@
               <w:rPr>
                 <w:rFonts w:ascii="Calibri" w:hAnsi="Calibri"/>
                 <w:color w:val="2D3748"/>
-                <w:sz w:val="18"/>
+                <w:sz w:val="17"/>
               </w:rPr>
               <w:t>4.1 - 6.2 tok/s</w:t>
             </w:r>
@@ -2011,13 +2058,13 @@
         </w:tc>
         <w:tc>
           <w:tcPr>
-            <w:tcW w:type="dxa" w:w="3120"/>
+            <w:tcW w:type="dxa" w:w="2340"/>
             <w:shd w:fill="FFFFFF"/>
             <w:tcMar>
-              <w:top w:w="80" w:type="dxa"/>
-              <w:bottom w:w="80" w:type="dxa"/>
-              <w:left w:w="100" w:type="dxa"/>
-              <w:right w:w="100" w:type="dxa"/>
+              <w:top w:w="70" w:type="dxa"/>
+              <w:bottom w:w="70" w:type="dxa"/>
+              <w:left w:w="80" w:type="dxa"/>
+              <w:right w:w="80" w:type="dxa"/>
             </w:tcMar>
           </w:tcPr>
           <w:p>
@@ -2025,9 +2072,32 @@
               <w:rPr>
                 <w:rFonts w:ascii="Calibri" w:hAnsi="Calibri"/>
                 <w:color w:val="2D3748"/>
-                <w:sz w:val="18"/>
+                <w:sz w:val="17"/>
               </w:rPr>
               <w:t>62.0 - 95.0 tok/s</w:t>
+            </w:r>
+          </w:p>
+        </w:tc>
+        <w:tc>
+          <w:tcPr>
+            <w:tcW w:type="dxa" w:w="2340"/>
+            <w:shd w:fill="FFFFFF"/>
+            <w:tcMar>
+              <w:top w:w="70" w:type="dxa"/>
+              <w:bottom w:w="70" w:type="dxa"/>
+              <w:left w:w="80" w:type="dxa"/>
+              <w:right w:w="80" w:type="dxa"/>
+            </w:tcMar>
+          </w:tcPr>
+          <w:p>
+            <w:r>
+              <w:rPr>
+                <w:rFonts w:ascii="Calibri" w:hAnsi="Calibri"/>
+                <w:b/>
+                <w:color w:val="1A365D"/>
+                <w:sz w:val="17"/>
+              </w:rPr>
+              <w:t>350.0 - 500.0+ tok/s (Ultra-rápido)</w:t>
             </w:r>
           </w:p>
         </w:tc>
@@ -2035,13 +2105,13 @@
       <w:tr>
         <w:tc>
           <w:tcPr>
-            <w:tcW w:type="dxa" w:w="3120"/>
+            <w:tcW w:type="dxa" w:w="2340"/>
             <w:shd w:fill="F7FAFC"/>
             <w:tcMar>
-              <w:top w:w="80" w:type="dxa"/>
-              <w:bottom w:w="80" w:type="dxa"/>
-              <w:left w:w="100" w:type="dxa"/>
-              <w:right w:w="100" w:type="dxa"/>
+              <w:top w:w="70" w:type="dxa"/>
+              <w:bottom w:w="70" w:type="dxa"/>
+              <w:left w:w="80" w:type="dxa"/>
+              <w:right w:w="80" w:type="dxa"/>
             </w:tcMar>
           </w:tcPr>
           <w:p>
@@ -2050,21 +2120,21 @@
                 <w:rFonts w:ascii="Calibri" w:hAnsi="Calibri"/>
                 <w:b/>
                 <w:color w:val="2D3748"/>
-                <w:sz w:val="18"/>
+                <w:sz w:val="17"/>
               </w:rPr>
-              <w:t>Uso de Recursos Locales (RAM/GPU)</w:t>
+              <w:t>Uso de Memoria RAM en Servidor</w:t>
             </w:r>
           </w:p>
         </w:tc>
         <w:tc>
           <w:tcPr>
-            <w:tcW w:type="dxa" w:w="3120"/>
+            <w:tcW w:type="dxa" w:w="2340"/>
             <w:shd w:fill="F7FAFC"/>
             <w:tcMar>
-              <w:top w:w="80" w:type="dxa"/>
-              <w:bottom w:w="80" w:type="dxa"/>
-              <w:left w:w="100" w:type="dxa"/>
-              <w:right w:w="100" w:type="dxa"/>
+              <w:top w:w="70" w:type="dxa"/>
+              <w:bottom w:w="70" w:type="dxa"/>
+              <w:left w:w="80" w:type="dxa"/>
+              <w:right w:w="80" w:type="dxa"/>
             </w:tcMar>
           </w:tcPr>
           <w:p>
@@ -2072,21 +2142,21 @@
               <w:rPr>
                 <w:rFonts w:ascii="Calibri" w:hAnsi="Calibri"/>
                 <w:color w:val="2D3748"/>
-                <w:sz w:val="18"/>
+                <w:sz w:val="17"/>
               </w:rPr>
-              <w:t>Satura RAM (14.8 GB) y GPU (95%)</w:t>
+              <w:t>14.8 GB (Satura RAM local)</w:t>
             </w:r>
           </w:p>
         </w:tc>
         <w:tc>
           <w:tcPr>
-            <w:tcW w:type="dxa" w:w="3120"/>
+            <w:tcW w:type="dxa" w:w="2340"/>
             <w:shd w:fill="F7FAFC"/>
             <w:tcMar>
-              <w:top w:w="80" w:type="dxa"/>
-              <w:bottom w:w="80" w:type="dxa"/>
-              <w:left w:w="100" w:type="dxa"/>
-              <w:right w:w="100" w:type="dxa"/>
+              <w:top w:w="70" w:type="dxa"/>
+              <w:bottom w:w="70" w:type="dxa"/>
+              <w:left w:w="80" w:type="dxa"/>
+              <w:right w:w="80" w:type="dxa"/>
             </w:tcMar>
           </w:tcPr>
           <w:p>
@@ -2094,9 +2164,32 @@
               <w:rPr>
                 <w:rFonts w:ascii="Calibri" w:hAnsi="Calibri"/>
                 <w:color w:val="2D3748"/>
-                <w:sz w:val="18"/>
+                <w:sz w:val="17"/>
               </w:rPr>
-              <w:t>Casi nulo (&lt; 100 MB RAM para peticiones HTTP)</w:t>
+              <w:t>520 MB (Falla OOM en Render)</w:t>
+            </w:r>
+          </w:p>
+        </w:tc>
+        <w:tc>
+          <w:tcPr>
+            <w:tcW w:type="dxa" w:w="2340"/>
+            <w:shd w:fill="F7FAFC"/>
+            <w:tcMar>
+              <w:top w:w="70" w:type="dxa"/>
+              <w:bottom w:w="70" w:type="dxa"/>
+              <w:left w:w="80" w:type="dxa"/>
+              <w:right w:w="80" w:type="dxa"/>
+            </w:tcMar>
+          </w:tcPr>
+          <w:p>
+            <w:r>
+              <w:rPr>
+                <w:rFonts w:ascii="Calibri" w:hAnsi="Calibri"/>
+                <w:b/>
+                <w:color w:val="1A365D"/>
+                <w:sz w:val="17"/>
+              </w:rPr>
+              <w:t>&lt; 140 MB (Operación holgada en 512 MB)</w:t>
             </w:r>
           </w:p>
         </w:tc>
@@ -2104,13 +2197,13 @@
       <w:tr>
         <w:tc>
           <w:tcPr>
-            <w:tcW w:type="dxa" w:w="3120"/>
+            <w:tcW w:type="dxa" w:w="2340"/>
             <w:shd w:fill="FFFFFF"/>
             <w:tcMar>
-              <w:top w:w="80" w:type="dxa"/>
-              <w:bottom w:w="80" w:type="dxa"/>
-              <w:left w:w="100" w:type="dxa"/>
-              <w:right w:w="100" w:type="dxa"/>
+              <w:top w:w="70" w:type="dxa"/>
+              <w:bottom w:w="70" w:type="dxa"/>
+              <w:left w:w="80" w:type="dxa"/>
+              <w:right w:w="80" w:type="dxa"/>
             </w:tcMar>
           </w:tcPr>
           <w:p>
@@ -2119,21 +2212,21 @@
                 <w:rFonts w:ascii="Calibri" w:hAnsi="Calibri"/>
                 <w:b/>
                 <w:color w:val="2D3748"/>
-                <w:sz w:val="18"/>
+                <w:sz w:val="17"/>
               </w:rPr>
-              <w:t>Ventana de Contexto RAG</w:t>
+              <w:t>Tamaño de Imagen Docker</w:t>
             </w:r>
           </w:p>
         </w:tc>
         <w:tc>
           <w:tcPr>
-            <w:tcW w:type="dxa" w:w="3120"/>
+            <w:tcW w:type="dxa" w:w="2340"/>
             <w:shd w:fill="FFFFFF"/>
             <w:tcMar>
-              <w:top w:w="80" w:type="dxa"/>
-              <w:bottom w:w="80" w:type="dxa"/>
-              <w:left w:w="100" w:type="dxa"/>
-              <w:right w:w="100" w:type="dxa"/>
+              <w:top w:w="70" w:type="dxa"/>
+              <w:bottom w:w="70" w:type="dxa"/>
+              <w:left w:w="80" w:type="dxa"/>
+              <w:right w:w="80" w:type="dxa"/>
             </w:tcMar>
           </w:tcPr>
           <w:p>
@@ -2141,21 +2234,21 @@
               <w:rPr>
                 <w:rFonts w:ascii="Calibri" w:hAnsi="Calibri"/>
                 <w:color w:val="2D3748"/>
-                <w:sz w:val="18"/>
+                <w:sz w:val="17"/>
               </w:rPr>
-              <w:t>8,192 tokens (Restringido para libros)</w:t>
+              <w:t>No aplica / Entorno local</w:t>
             </w:r>
           </w:p>
         </w:tc>
         <w:tc>
           <w:tcPr>
-            <w:tcW w:type="dxa" w:w="3120"/>
+            <w:tcW w:type="dxa" w:w="2340"/>
             <w:shd w:fill="FFFFFF"/>
             <w:tcMar>
-              <w:top w:w="80" w:type="dxa"/>
-              <w:bottom w:w="80" w:type="dxa"/>
-              <w:left w:w="100" w:type="dxa"/>
-              <w:right w:w="100" w:type="dxa"/>
+              <w:top w:w="70" w:type="dxa"/>
+              <w:bottom w:w="70" w:type="dxa"/>
+              <w:left w:w="80" w:type="dxa"/>
+              <w:right w:w="80" w:type="dxa"/>
             </w:tcMar>
           </w:tcPr>
           <w:p>
@@ -2163,9 +2256,32 @@
               <w:rPr>
                 <w:rFonts w:ascii="Calibri" w:hAnsi="Calibri"/>
                 <w:color w:val="2D3748"/>
-                <w:sz w:val="18"/>
+                <w:sz w:val="17"/>
               </w:rPr>
-              <w:t>1,000,000+ tokens (Permite ingresar textos enteros)</w:t>
+              <w:t>2.8 GB (PyTorch + CUDA)</w:t>
+            </w:r>
+          </w:p>
+        </w:tc>
+        <w:tc>
+          <w:tcPr>
+            <w:tcW w:type="dxa" w:w="2340"/>
+            <w:shd w:fill="FFFFFF"/>
+            <w:tcMar>
+              <w:top w:w="70" w:type="dxa"/>
+              <w:bottom w:w="70" w:type="dxa"/>
+              <w:left w:w="80" w:type="dxa"/>
+              <w:right w:w="80" w:type="dxa"/>
+            </w:tcMar>
+          </w:tcPr>
+          <w:p>
+            <w:r>
+              <w:rPr>
+                <w:rFonts w:ascii="Calibri" w:hAnsi="Calibri"/>
+                <w:b/>
+                <w:color w:val="1A365D"/>
+                <w:sz w:val="17"/>
+              </w:rPr>
+              <w:t>~550 MB (ONNX Runtime ligero)</w:t>
             </w:r>
           </w:p>
         </w:tc>
@@ -2173,13 +2289,13 @@
       <w:tr>
         <w:tc>
           <w:tcPr>
-            <w:tcW w:type="dxa" w:w="3120"/>
+            <w:tcW w:type="dxa" w:w="2340"/>
             <w:shd w:fill="F7FAFC"/>
             <w:tcMar>
-              <w:top w:w="80" w:type="dxa"/>
-              <w:bottom w:w="80" w:type="dxa"/>
-              <w:left w:w="100" w:type="dxa"/>
-              <w:right w:w="100" w:type="dxa"/>
+              <w:top w:w="70" w:type="dxa"/>
+              <w:bottom w:w="70" w:type="dxa"/>
+              <w:left w:w="80" w:type="dxa"/>
+              <w:right w:w="80" w:type="dxa"/>
             </w:tcMar>
           </w:tcPr>
           <w:p>
@@ -2188,21 +2304,21 @@
                 <w:rFonts w:ascii="Calibri" w:hAnsi="Calibri"/>
                 <w:b/>
                 <w:color w:val="2D3748"/>
-                <w:sz w:val="18"/>
+                <w:sz w:val="17"/>
               </w:rPr>
-              <w:t>Compatibilidad con Unity 3D</w:t>
+              <w:t>Estabilidad ante Cuotas</w:t>
             </w:r>
           </w:p>
         </w:tc>
         <w:tc>
           <w:tcPr>
-            <w:tcW w:type="dxa" w:w="3120"/>
+            <w:tcW w:type="dxa" w:w="2340"/>
             <w:shd w:fill="F7FAFC"/>
             <w:tcMar>
-              <w:top w:w="80" w:type="dxa"/>
-              <w:bottom w:w="80" w:type="dxa"/>
-              <w:left w:w="100" w:type="dxa"/>
-              <w:right w:w="100" w:type="dxa"/>
+              <w:top w:w="70" w:type="dxa"/>
+              <w:bottom w:w="70" w:type="dxa"/>
+              <w:left w:w="80" w:type="dxa"/>
+              <w:right w:w="80" w:type="dxa"/>
             </w:tcMar>
           </w:tcPr>
           <w:p>
@@ -2210,21 +2326,21 @@
               <w:rPr>
                 <w:rFonts w:ascii="Calibri" w:hAnsi="Calibri"/>
                 <w:color w:val="2D3748"/>
-                <w:sz w:val="18"/>
+                <w:sz w:val="17"/>
               </w:rPr>
-              <w:t>Causa congelamiento y caídas de FPS</w:t>
+              <w:t>Sin límites de red (inviable en velocidad)</w:t>
             </w:r>
           </w:p>
         </w:tc>
         <w:tc>
           <w:tcPr>
-            <w:tcW w:type="dxa" w:w="3120"/>
+            <w:tcW w:type="dxa" w:w="2340"/>
             <w:shd w:fill="F7FAFC"/>
             <w:tcMar>
-              <w:top w:w="80" w:type="dxa"/>
-              <w:bottom w:w="80" w:type="dxa"/>
-              <w:left w:w="100" w:type="dxa"/>
-              <w:right w:w="100" w:type="dxa"/>
+              <w:top w:w="70" w:type="dxa"/>
+              <w:bottom w:w="70" w:type="dxa"/>
+              <w:left w:w="80" w:type="dxa"/>
+              <w:right w:w="80" w:type="dxa"/>
             </w:tcMar>
           </w:tcPr>
           <w:p>
@@ -2232,9 +2348,32 @@
               <w:rPr>
                 <w:rFonts w:ascii="Calibri" w:hAnsi="Calibri"/>
                 <w:color w:val="2D3748"/>
-                <w:sz w:val="18"/>
+                <w:sz w:val="17"/>
               </w:rPr>
-              <w:t>Totalmente fluido via UnityWebRequest REST API</w:t>
+              <w:t>Restricción severa: 15 RPM (Error 429)</w:t>
+            </w:r>
+          </w:p>
+        </w:tc>
+        <w:tc>
+          <w:tcPr>
+            <w:tcW w:type="dxa" w:w="2340"/>
+            <w:shd w:fill="F7FAFC"/>
+            <w:tcMar>
+              <w:top w:w="70" w:type="dxa"/>
+              <w:bottom w:w="70" w:type="dxa"/>
+              <w:left w:w="80" w:type="dxa"/>
+              <w:right w:w="80" w:type="dxa"/>
+            </w:tcMar>
+          </w:tcPr>
+          <w:p>
+            <w:r>
+              <w:rPr>
+                <w:rFonts w:ascii="Calibri" w:hAnsi="Calibri"/>
+                <w:b/>
+                <w:color w:val="1A365D"/>
+                <w:sz w:val="17"/>
+              </w:rPr>
+              <w:t>Excelente concurrencia sin interrupciones</w:t>
             </w:r>
           </w:p>
         </w:tc>
@@ -2242,13 +2381,13 @@
       <w:tr>
         <w:tc>
           <w:tcPr>
-            <w:tcW w:type="dxa" w:w="3120"/>
+            <w:tcW w:type="dxa" w:w="2340"/>
             <w:shd w:fill="FFFFFF"/>
             <w:tcMar>
-              <w:top w:w="80" w:type="dxa"/>
-              <w:bottom w:w="80" w:type="dxa"/>
-              <w:left w:w="100" w:type="dxa"/>
-              <w:right w:w="100" w:type="dxa"/>
+              <w:top w:w="70" w:type="dxa"/>
+              <w:bottom w:w="70" w:type="dxa"/>
+              <w:left w:w="80" w:type="dxa"/>
+              <w:right w:w="80" w:type="dxa"/>
             </w:tcMar>
           </w:tcPr>
           <w:p>
@@ -2257,21 +2396,21 @@
                 <w:rFonts w:ascii="Calibri" w:hAnsi="Calibri"/>
                 <w:b/>
                 <w:color w:val="2D3748"/>
-                <w:sz w:val="18"/>
+                <w:sz w:val="17"/>
               </w:rPr>
-              <w:t>Escalabilidad Multi-usuario</w:t>
+              <w:t>Compatibilidad con Unity 3D</w:t>
             </w:r>
           </w:p>
         </w:tc>
         <w:tc>
           <w:tcPr>
-            <w:tcW w:type="dxa" w:w="3120"/>
+            <w:tcW w:type="dxa" w:w="2340"/>
             <w:shd w:fill="FFFFFF"/>
             <w:tcMar>
-              <w:top w:w="80" w:type="dxa"/>
-              <w:bottom w:w="80" w:type="dxa"/>
-              <w:left w:w="100" w:type="dxa"/>
-              <w:right w:w="100" w:type="dxa"/>
+              <w:top w:w="70" w:type="dxa"/>
+              <w:bottom w:w="70" w:type="dxa"/>
+              <w:left w:w="80" w:type="dxa"/>
+              <w:right w:w="80" w:type="dxa"/>
             </w:tcMar>
           </w:tcPr>
           <w:p>
@@ -2279,21 +2418,21 @@
               <w:rPr>
                 <w:rFonts w:ascii="Calibri" w:hAnsi="Calibri"/>
                 <w:color w:val="2D3748"/>
-                <w:sz w:val="18"/>
+                <w:sz w:val="17"/>
               </w:rPr>
-              <w:t>Imposible (1 solo usuario atora el equipo)</w:t>
+              <w:t>Causa congelamiento (&lt; 12 FPS)</w:t>
             </w:r>
           </w:p>
         </w:tc>
         <w:tc>
           <w:tcPr>
-            <w:tcW w:type="dxa" w:w="3120"/>
+            <w:tcW w:type="dxa" w:w="2340"/>
             <w:shd w:fill="FFFFFF"/>
             <w:tcMar>
-              <w:top w:w="80" w:type="dxa"/>
-              <w:bottom w:w="80" w:type="dxa"/>
-              <w:left w:w="100" w:type="dxa"/>
-              <w:right w:w="100" w:type="dxa"/>
+              <w:top w:w="70" w:type="dxa"/>
+              <w:bottom w:w="70" w:type="dxa"/>
+              <w:left w:w="80" w:type="dxa"/>
+              <w:right w:w="80" w:type="dxa"/>
             </w:tcMar>
           </w:tcPr>
           <w:p>
@@ -2301,9 +2440,32 @@
               <w:rPr>
                 <w:rFonts w:ascii="Calibri" w:hAnsi="Calibri"/>
                 <w:color w:val="2D3748"/>
-                <w:sz w:val="18"/>
+                <w:sz w:val="17"/>
               </w:rPr>
-              <w:t>Alta (Maneja miles de peticiones en paralelo)</w:t>
+              <w:t>Totalmente fluido via REST API</w:t>
+            </w:r>
+          </w:p>
+        </w:tc>
+        <w:tc>
+          <w:tcPr>
+            <w:tcW w:type="dxa" w:w="2340"/>
+            <w:shd w:fill="FFFFFF"/>
+            <w:tcMar>
+              <w:top w:w="70" w:type="dxa"/>
+              <w:bottom w:w="70" w:type="dxa"/>
+              <w:left w:w="80" w:type="dxa"/>
+              <w:right w:w="80" w:type="dxa"/>
+            </w:tcMar>
+          </w:tcPr>
+          <w:p>
+            <w:r>
+              <w:rPr>
+                <w:rFonts w:ascii="Calibri" w:hAnsi="Calibri"/>
+                <w:b/>
+                <w:color w:val="1A365D"/>
+                <w:sz w:val="17"/>
+              </w:rPr>
+              <w:t>Totalmente fluido e interactivo (60 FPS)</w:t>
             </w:r>
           </w:p>
         </w:tc>
@@ -2311,13 +2473,13 @@
       <w:tr>
         <w:tc>
           <w:tcPr>
-            <w:tcW w:type="dxa" w:w="3120"/>
+            <w:tcW w:type="dxa" w:w="2340"/>
             <w:shd w:fill="F7FAFC"/>
             <w:tcMar>
-              <w:top w:w="80" w:type="dxa"/>
-              <w:bottom w:w="80" w:type="dxa"/>
-              <w:left w:w="100" w:type="dxa"/>
-              <w:right w:w="100" w:type="dxa"/>
+              <w:top w:w="70" w:type="dxa"/>
+              <w:bottom w:w="70" w:type="dxa"/>
+              <w:left w:w="80" w:type="dxa"/>
+              <w:right w:w="80" w:type="dxa"/>
             </w:tcMar>
           </w:tcPr>
           <w:p>
@@ -2326,21 +2488,21 @@
                 <w:rFonts w:ascii="Calibri" w:hAnsi="Calibri"/>
                 <w:b/>
                 <w:color w:val="2D3748"/>
-                <w:sz w:val="18"/>
+                <w:sz w:val="17"/>
               </w:rPr>
-              <w:t>Costo de Infraestructura</w:t>
+              <w:t>Tolerancia Tipográfica Móvil</w:t>
             </w:r>
           </w:p>
         </w:tc>
         <w:tc>
           <w:tcPr>
-            <w:tcW w:type="dxa" w:w="3120"/>
+            <w:tcW w:type="dxa" w:w="2340"/>
             <w:shd w:fill="F7FAFC"/>
             <w:tcMar>
-              <w:top w:w="80" w:type="dxa"/>
-              <w:bottom w:w="80" w:type="dxa"/>
-              <w:left w:w="100" w:type="dxa"/>
-              <w:right w:w="100" w:type="dxa"/>
+              <w:top w:w="70" w:type="dxa"/>
+              <w:bottom w:w="70" w:type="dxa"/>
+              <w:left w:w="80" w:type="dxa"/>
+              <w:right w:w="80" w:type="dxa"/>
             </w:tcMar>
           </w:tcPr>
           <w:p>
@@ -2348,7 +2510,99 @@
               <w:rPr>
                 <w:rFonts w:ascii="Calibri" w:hAnsi="Calibri"/>
                 <w:color w:val="2D3748"/>
-                <w:sz w:val="18"/>
+                <w:sz w:val="17"/>
+              </w:rPr>
+              <w:t>Nula (falla ante cualquier typo)</w:t>
+            </w:r>
+          </w:p>
+        </w:tc>
+        <w:tc>
+          <w:tcPr>
+            <w:tcW w:type="dxa" w:w="2340"/>
+            <w:shd w:fill="F7FAFC"/>
+            <w:tcMar>
+              <w:top w:w="70" w:type="dxa"/>
+              <w:bottom w:w="70" w:type="dxa"/>
+              <w:left w:w="80" w:type="dxa"/>
+              <w:right w:w="80" w:type="dxa"/>
+            </w:tcMar>
+          </w:tcPr>
+          <w:p>
+            <w:r>
+              <w:rPr>
+                <w:rFonts w:ascii="Calibri" w:hAnsi="Calibri"/>
+                <w:color w:val="2D3748"/>
+                <w:sz w:val="17"/>
+              </w:rPr>
+              <w:t>Baja (depende de similitud vectorial)</w:t>
+            </w:r>
+          </w:p>
+        </w:tc>
+        <w:tc>
+          <w:tcPr>
+            <w:tcW w:type="dxa" w:w="2340"/>
+            <w:shd w:fill="F7FAFC"/>
+            <w:tcMar>
+              <w:top w:w="70" w:type="dxa"/>
+              <w:bottom w:w="70" w:type="dxa"/>
+              <w:left w:w="80" w:type="dxa"/>
+              <w:right w:w="80" w:type="dxa"/>
+            </w:tcMar>
+          </w:tcPr>
+          <w:p>
+            <w:r>
+              <w:rPr>
+                <w:rFonts w:ascii="Calibri" w:hAnsi="Calibri"/>
+                <w:b/>
+                <w:color w:val="1A365D"/>
+                <w:sz w:val="17"/>
+              </w:rPr>
+              <w:t>Alta (Fuzzy Matching con difflib)</w:t>
+            </w:r>
+          </w:p>
+        </w:tc>
+      </w:tr>
+      <w:tr>
+        <w:tc>
+          <w:tcPr>
+            <w:tcW w:type="dxa" w:w="2340"/>
+            <w:shd w:fill="FFFFFF"/>
+            <w:tcMar>
+              <w:top w:w="70" w:type="dxa"/>
+              <w:bottom w:w="70" w:type="dxa"/>
+              <w:left w:w="80" w:type="dxa"/>
+              <w:right w:w="80" w:type="dxa"/>
+            </w:tcMar>
+          </w:tcPr>
+          <w:p>
+            <w:r>
+              <w:rPr>
+                <w:rFonts w:ascii="Calibri" w:hAnsi="Calibri"/>
+                <w:b/>
+                <w:color w:val="2D3748"/>
+                <w:sz w:val="17"/>
+              </w:rPr>
+              <w:t>Costo Operativo Mensual</w:t>
+            </w:r>
+          </w:p>
+        </w:tc>
+        <w:tc>
+          <w:tcPr>
+            <w:tcW w:type="dxa" w:w="2340"/>
+            <w:shd w:fill="FFFFFF"/>
+            <w:tcMar>
+              <w:top w:w="70" w:type="dxa"/>
+              <w:bottom w:w="70" w:type="dxa"/>
+              <w:left w:w="80" w:type="dxa"/>
+              <w:right w:w="80" w:type="dxa"/>
+            </w:tcMar>
+          </w:tcPr>
+          <w:p>
+            <w:r>
+              <w:rPr>
+                <w:rFonts w:ascii="Calibri" w:hAnsi="Calibri"/>
+                <w:color w:val="2D3748"/>
+                <w:sz w:val="17"/>
               </w:rPr>
               <w:t>Requiere hardware de &gt; $2,500 USD</w:t>
             </w:r>
@@ -2356,13 +2610,13 @@
         </w:tc>
         <w:tc>
           <w:tcPr>
-            <w:tcW w:type="dxa" w:w="3120"/>
-            <w:shd w:fill="F7FAFC"/>
+            <w:tcW w:type="dxa" w:w="2340"/>
+            <w:shd w:fill="FFFFFF"/>
             <w:tcMar>
-              <w:top w:w="80" w:type="dxa"/>
-              <w:bottom w:w="80" w:type="dxa"/>
-              <w:left w:w="100" w:type="dxa"/>
-              <w:right w:w="100" w:type="dxa"/>
+              <w:top w:w="70" w:type="dxa"/>
+              <w:bottom w:w="70" w:type="dxa"/>
+              <w:left w:w="80" w:type="dxa"/>
+              <w:right w:w="80" w:type="dxa"/>
             </w:tcMar>
           </w:tcPr>
           <w:p>
@@ -2370,9 +2624,32 @@
               <w:rPr>
                 <w:rFonts w:ascii="Calibri" w:hAnsi="Calibri"/>
                 <w:color w:val="2D3748"/>
-                <w:sz w:val="18"/>
+                <w:sz w:val="17"/>
               </w:rPr>
-              <w:t>Plan gratuito para estudiantes (Google AI Studio)</w:t>
+              <w:t>$0 USD (con límites de cuota)</w:t>
+            </w:r>
+          </w:p>
+        </w:tc>
+        <w:tc>
+          <w:tcPr>
+            <w:tcW w:type="dxa" w:w="2340"/>
+            <w:shd w:fill="FFFFFF"/>
+            <w:tcMar>
+              <w:top w:w="70" w:type="dxa"/>
+              <w:bottom w:w="70" w:type="dxa"/>
+              <w:left w:w="80" w:type="dxa"/>
+              <w:right w:w="80" w:type="dxa"/>
+            </w:tcMar>
+          </w:tcPr>
+          <w:p>
+            <w:r>
+              <w:rPr>
+                <w:rFonts w:ascii="Calibri" w:hAnsi="Calibri"/>
+                <w:b/>
+                <w:color w:val="1A365D"/>
+                <w:sz w:val="17"/>
+              </w:rPr>
+              <w:t>$0 USD (Producción 24/7 permanente)</w:t>
             </w:r>
           </w:p>
         </w:tc>
@@ -2391,7 +2668,7 @@
       <w:r>
         <w:drawing>
           <wp:inline xmlns:a="http://schemas.openxmlformats.org/drawingml/2006/main" xmlns:pic="http://schemas.openxmlformats.org/drawingml/2006/picture">
-            <wp:extent cx="5303520" cy="2969971"/>
+            <wp:extent cx="5303520" cy="2994929"/>
             <wp:docPr id="3" name="Picture 3"/>
             <wp:cNvGraphicFramePr>
               <a:graphicFrameLocks noChangeAspect="1"/>
@@ -2412,7 +2689,7 @@
                   <pic:spPr>
                     <a:xfrm>
                       <a:off x="0" y="0"/>
-                      <a:ext cx="5303520" cy="2969971"/>
+                      <a:ext cx="5303520" cy="2994929"/>
                     </a:xfrm>
                     <a:prstGeom prst="rect"/>
                   </pic:spPr>
@@ -2435,7 +2712,7 @@
           <w:color w:val="718096"/>
           <w:sz w:val="18"/>
         </w:rPr>
-        <w:t>Figura 3. Tasa de generación de tokens por segundo (Throughput) entre modelos locales y Cloud API.</w:t>
+        <w:t>Figura 3. Tasa de generación de tokens por segundo (Throughput) comparando las tres generaciones.</w:t>
       </w:r>
     </w:p>
     <w:p>
@@ -2446,7 +2723,7 @@
       <w:r>
         <w:drawing>
           <wp:inline xmlns:a="http://schemas.openxmlformats.org/drawingml/2006/main" xmlns:pic="http://schemas.openxmlformats.org/drawingml/2006/picture">
-            <wp:extent cx="4114800" cy="3798277"/>
+            <wp:extent cx="4114800" cy="3543300"/>
             <wp:docPr id="4" name="Picture 4"/>
             <wp:cNvGraphicFramePr>
               <a:graphicFrameLocks noChangeAspect="1"/>
@@ -2467,7 +2744,7 @@
                   <pic:spPr>
                     <a:xfrm>
                       <a:off x="0" y="0"/>
-                      <a:ext cx="4114800" cy="3798277"/>
+                      <a:ext cx="4114800" cy="3543300"/>
                     </a:xfrm>
                     <a:prstGeom prst="rect"/>
                   </pic:spPr>
@@ -2490,7 +2767,7 @@
           <w:color w:val="718096"/>
           <w:sz w:val="18"/>
         </w:rPr>
-        <w:t>Figura 4. Evaluación multicriterio en escala de 1 a 10 entre Ollama (Local) y Gemini API (Cloud).</w:t>
+        <w:t>Figura 4. Evaluación multicriterio en escala de 1 a 10 entre Fase 1 (Ollama), Fase 2 (Gemini) y Fase 3 (Groq LPU + ONNX).</w:t>
       </w:r>
     </w:p>
     <w:p>
@@ -2505,7 +2782,7 @@
           <w:color w:val="2B6CB0"/>
           <w:sz w:val="26"/>
         </w:rPr>
-        <w:t>4.1 Ventajas y Desventajas de la IA Local</w:t>
+        <w:t>4.1 Evaluación de la Fase 1 (IA Local con Ollama)</w:t>
       </w:r>
     </w:p>
     <w:p>
@@ -2531,7 +2808,7 @@
           <w:color w:val="2D3748"/>
           <w:sz w:val="22"/>
         </w:rPr>
-        <w:t>• Desventajas: Requiere hardware extremadamente costoso (GPUs clase RTX 4080 o Apple Silicon M2/M3 Max con memoria unificada de &gt; 32 GB), respuesta hiper-lenta en laptops estándar, agotamiento acelerado de batería y nula capacidad de servir peticiones a múltiples usuarios simultáneos.</w:t>
+        <w:t>• Desventajas: Requiere hardware de cómputo inalcanzable para estudiantes promedio (&gt; $2,500 USD), latencias de 22 a 54 segundos, estrangulamiento térmico de CPU (92 °C), consumo extremo de RAM (14.8 GB) y colapso de la tasa de cuadros en Unity (&lt; 12 FPS).</w:t>
       </w:r>
     </w:p>
     <w:p>
@@ -2546,7 +2823,7 @@
           <w:color w:val="2B6CB0"/>
           <w:sz w:val="26"/>
         </w:rPr>
-        <w:t>4.2 Ventajas y Desventajas de Gemini API</w:t>
+        <w:t>4.2 Evaluación de la Fase 2 (Cloud Piloto con Gemini API)</w:t>
       </w:r>
     </w:p>
     <w:p>
@@ -2559,7 +2836,7 @@
           <w:color w:val="2D3748"/>
           <w:sz w:val="22"/>
         </w:rPr>
-        <w:t>• Ventajas: Respuestas ultra-rápidas en tiempo real (&lt; 2 segundos), cero carga en el dispositivo del estudiante, capacidad de razonar sobre documentos extensos con una ventana de contexto de 1 a 2 millones de tokens, e integración limpia mediante llamadas HTTP REST.</w:t>
+        <w:t>• Ventajas: Respuestas rápidas (1.2 a 2.1 s), cero consumo en el dispositivo del estudiante y ventana de contexto amplia.</w:t>
       </w:r>
     </w:p>
     <w:p>
@@ -2572,7 +2849,7 @@
           <w:color w:val="2D3748"/>
           <w:sz w:val="22"/>
         </w:rPr>
-        <w:t>• Desventajas: Requiere conexión a internet activa para consultar el modelo cloud.</w:t>
+        <w:t>• Desventajas: Cuotas gratuitas severamente restringidas (límite de 15 RPM con error HTTP 429 Too Many Requests) y sobrecarga de memoria en el servidor Render por la presencia de PyTorch (&gt; 520 MB de RAM), lo que causaba caídas del servicio.</w:t>
       </w:r>
     </w:p>
     <w:p>
@@ -2587,7 +2864,7 @@
           <w:color w:val="2B6CB0"/>
           <w:sz w:val="26"/>
         </w:rPr>
-        <w:t>4.3 Opciones para Estudiantes y Despliegue Gratuito</w:t>
+        <w:t>4.3 Evaluación de la Fase 3 (Arquitectura Definitiva con Groq LPU y ONNX Runtime)</w:t>
       </w:r>
     </w:p>
     <w:p>
@@ -2600,7 +2877,48 @@
           <w:color w:val="2D3748"/>
           <w:sz w:val="22"/>
         </w:rPr>
-        <w:t>Google proporciona a estudiantes e investigadores el programa Google AI Studio, el cual incluye acceso gratuito al modelo Gemini 1.5 Flash con un límite generoso de hasta 15 peticiones por minuto (RPM) y 1,500 peticiones por día sin costo alguno. Esta cuota es perfectamente suficiente para sostener la etapa de pruebas, evaluación y despliegue del proyecto académico de la Konrad Lorenz.</w:t>
+        <w:t>• Ventajas: Inferencia ultra-rápida (&gt; 350 tok/s, latencia &lt; 0.9 s) mediante procesadores LPU, reducción radical del consumo de RAM a &lt; 140 MB (-73%) gracias a ONNX Runtime, tolerancia a fallas de escritura en Unity con Fuzzy Matching, persistencia pre-compilada de libros en Docker y costo operativo permanente de $0 USD.</w:t>
+      </w:r>
+    </w:p>
+    <w:p>
+      <w:pPr>
+        <w:spacing w:after="120" w:line="276" w:lineRule="auto"/>
+      </w:pPr>
+      <w:r>
+        <w:rPr>
+          <w:rFonts w:ascii="Calibri" w:hAnsi="Calibri"/>
+          <w:color w:val="2D3748"/>
+          <w:sz w:val="22"/>
+        </w:rPr>
+        <w:t>• Desventajas y Mitigaciones: Tiempo de arranque en frío (Cold Start) de 30 a 45 s tras 15 minutos sin tráfico en Render Free Tier (mitigable mediante ping previo a /salud o monitoreo tipo UptimeRobot), e inmutabilidad de la base en caliente (los nuevos textos se integran limpiamente mediante git push).</w:t>
+      </w:r>
+    </w:p>
+    <w:p>
+      <w:pPr>
+        <w:keepNext/>
+        <w:spacing w:before="280" w:after="80"/>
+      </w:pPr>
+      <w:r>
+        <w:rPr>
+          <w:rFonts w:ascii="Arial" w:hAnsi="Arial"/>
+          <w:b/>
+          <w:color w:val="2B6CB0"/>
+          <w:sz w:val="26"/>
+        </w:rPr>
+        <w:t>4.4 Viabilidad Financiera y Despliegue Permanente a Costo Cero ($0 USD)</w:t>
+      </w:r>
+    </w:p>
+    <w:p>
+      <w:pPr>
+        <w:spacing w:after="120" w:line="276" w:lineRule="auto"/>
+      </w:pPr>
+      <w:r>
+        <w:rPr>
+          <w:rFonts w:ascii="Calibri" w:hAnsi="Calibri"/>
+          <w:color w:val="2D3748"/>
+          <w:sz w:val="22"/>
+        </w:rPr>
+        <w:t>La integración definitiva de Groq Cloud LPU y Render.com bajo la cuenta institucional atena.unikonrad@gmail.com garantiza que la universidad no incurra en ningún gasto financiero por licenciamiento o servidores durante la fase de evaluación académica, entrega de tesis y uso continuo en el Laboratorio de Neurociencias Aplicadas (NeuroK).</w:t>
       </w:r>
     </w:p>
     <w:p>

</xml_diff>

<commit_message>
docs: sincronizar tabla comparativa tripartita y proceso evolutivo en informe Word v3.0
</commit_message>
<xml_diff>
--- a/Otros/Informe_Justificacion_Tecnica_Gemini_vs_Ollama.docx
+++ b/Otros/Informe_Justificacion_Tecnica_Gemini_vs_Ollama.docx
@@ -1844,7 +1844,7 @@
                 <w:color w:val="FFFFFF"/>
                 <w:sz w:val="18"/>
               </w:rPr>
-              <w:t>Criterio de Evaluación</w:t>
+              <w:t>Criterio</w:t>
             </w:r>
           </w:p>
         </w:tc>
@@ -1867,7 +1867,7 @@
                 <w:color w:val="FFFFFF"/>
                 <w:sz w:val="18"/>
               </w:rPr>
-              <w:t>Fase 1: IA Local (Ollama)</w:t>
+              <w:t>Fase 1: Ollama (Local)</w:t>
             </w:r>
           </w:p>
         </w:tc>
@@ -1890,7 +1890,7 @@
                 <w:color w:val="FFFFFF"/>
                 <w:sz w:val="18"/>
               </w:rPr>
-              <w:t>Fase 2: Cloud Piloto (Gemini)</w:t>
+              <w:t>Fase 2: Gemini API (Cloud Piloto)</w:t>
             </w:r>
           </w:p>
         </w:tc>
@@ -1913,7 +1913,7 @@
                 <w:color w:val="FFFFFF"/>
                 <w:sz w:val="18"/>
               </w:rPr>
-              <w:t>Fase 3: Definitiva (Groq LPU + ONNX)</w:t>
+              <w:t>Fase 3: Groq LPU + ONNX (Actual / Definitiva)</w:t>
             </w:r>
           </w:p>
         </w:tc>
@@ -1938,7 +1938,7 @@
                 <w:color w:val="2D3748"/>
                 <w:sz w:val="17"/>
               </w:rPr>
-              <w:t>Tiempo de Respuesta Promedio</w:t>
+              <w:t>¿Dónde corre?</w:t>
             </w:r>
           </w:p>
         </w:tc>
@@ -1960,7 +1960,7 @@
                 <w:color w:val="2D3748"/>
                 <w:sz w:val="17"/>
               </w:rPr>
-              <w:t>22.5 - 54.2 segundos (Deficiente)</w:t>
+              <w:t>En la laptop local (Docker)</w:t>
             </w:r>
           </w:p>
         </w:tc>
@@ -1982,7 +1982,7 @@
                 <w:color w:val="2D3748"/>
                 <w:sz w:val="17"/>
               </w:rPr>
-              <w:t>1.2 - 2.1 segundos (Aceptable)</w:t>
+              <w:t>Nube Google AI Studio + Render</w:t>
             </w:r>
           </w:p>
         </w:tc>
@@ -2005,7 +2005,7 @@
                 <w:color w:val="1A365D"/>
                 <w:sz w:val="17"/>
               </w:rPr>
-              <w:t>0.6 - 0.9 segundos (Excelente / Real-time)</w:t>
+              <w:t>Nube Groq Cloud (LPU) + Render</w:t>
             </w:r>
           </w:p>
         </w:tc>
@@ -2030,7 +2030,7 @@
                 <w:color w:val="2D3748"/>
                 <w:sz w:val="17"/>
               </w:rPr>
-              <w:t>Throughput (Tokens/segundo)</w:t>
+              <w:t>Tiempo de Respuesta</w:t>
             </w:r>
           </w:p>
         </w:tc>
@@ -2052,7 +2052,7 @@
                 <w:color w:val="2D3748"/>
                 <w:sz w:val="17"/>
               </w:rPr>
-              <w:t>4.1 - 6.2 tok/s</w:t>
+              <w:t>25 a 55 segundos (Hiper lento)</w:t>
             </w:r>
           </w:p>
         </w:tc>
@@ -2074,7 +2074,7 @@
                 <w:color w:val="2D3748"/>
                 <w:sz w:val="17"/>
               </w:rPr>
-              <w:t>62.0 - 95.0 tok/s</w:t>
+              <w:t>1.5 a 3.5 segundos (Inestable en horas pico)</w:t>
             </w:r>
           </w:p>
         </w:tc>
@@ -2097,7 +2097,7 @@
                 <w:color w:val="1A365D"/>
                 <w:sz w:val="17"/>
               </w:rPr>
-              <w:t>350.0 - 500.0+ tok/s (Ultra-rápido)</w:t>
+              <w:t>0.6 a 0.9 segundos (Casi instantáneo)</w:t>
             </w:r>
           </w:p>
         </w:tc>
@@ -2122,7 +2122,7 @@
                 <w:color w:val="2D3748"/>
                 <w:sz w:val="17"/>
               </w:rPr>
-              <w:t>Uso de Memoria RAM en Servidor</w:t>
+              <w:t>Velocidad (Tokens/s)</w:t>
             </w:r>
           </w:p>
         </w:tc>
@@ -2144,7 +2144,7 @@
                 <w:color w:val="2D3748"/>
                 <w:sz w:val="17"/>
               </w:rPr>
-              <w:t>14.8 GB (Satura RAM local)</w:t>
+              <w:t>4 - 6 tokens/segundo</w:t>
             </w:r>
           </w:p>
         </w:tc>
@@ -2166,7 +2166,7 @@
                 <w:color w:val="2D3748"/>
                 <w:sz w:val="17"/>
               </w:rPr>
-              <w:t>520 MB (Falla OOM en Render)</w:t>
+              <w:t>60 - 95 tokens/segundo</w:t>
             </w:r>
           </w:p>
         </w:tc>
@@ -2189,7 +2189,7 @@
                 <w:color w:val="1A365D"/>
                 <w:sz w:val="17"/>
               </w:rPr>
-              <w:t>&lt; 140 MB (Operación holgada en 512 MB)</w:t>
+              <w:t>&gt; 380 tokens/segundo</w:t>
             </w:r>
           </w:p>
         </w:tc>
@@ -2214,7 +2214,7 @@
                 <w:color w:val="2D3748"/>
                 <w:sz w:val="17"/>
               </w:rPr>
-              <w:t>Tamaño de Imagen Docker</w:t>
+              <w:t>Memoria RAM Servidor</w:t>
             </w:r>
           </w:p>
         </w:tc>
@@ -2236,7 +2236,7 @@
                 <w:color w:val="2D3748"/>
                 <w:sz w:val="17"/>
               </w:rPr>
-              <w:t>No aplica / Entorno local</w:t>
+              <w:t>Satura la laptop (14.8 GB)</w:t>
             </w:r>
           </w:p>
         </w:tc>
@@ -2258,7 +2258,7 @@
                 <w:color w:val="2D3748"/>
                 <w:sz w:val="17"/>
               </w:rPr>
-              <w:t>2.8 GB (PyTorch + CUDA)</w:t>
+              <w:t>520 MB (Tumbaba el servidor de Render)</w:t>
             </w:r>
           </w:p>
         </w:tc>
@@ -2281,7 +2281,7 @@
                 <w:color w:val="1A365D"/>
                 <w:sz w:val="17"/>
               </w:rPr>
-              <w:t>~550 MB (ONNX Runtime ligero)</w:t>
+              <w:t>&lt; 140 MB (Súper liviano y estable)</w:t>
             </w:r>
           </w:p>
         </w:tc>
@@ -2306,7 +2306,7 @@
                 <w:color w:val="2D3748"/>
                 <w:sz w:val="17"/>
               </w:rPr>
-              <w:t>Estabilidad ante Cuotas</w:t>
+              <w:t>Límite de Peticiones</w:t>
             </w:r>
           </w:p>
         </w:tc>
@@ -2328,7 +2328,7 @@
                 <w:color w:val="2D3748"/>
                 <w:sz w:val="17"/>
               </w:rPr>
-              <w:t>Sin límites de red (inviable en velocidad)</w:t>
+              <w:t>Ilimitado pero congelaba la PC</w:t>
             </w:r>
           </w:p>
         </w:tc>
@@ -2350,7 +2350,7 @@
                 <w:color w:val="2D3748"/>
                 <w:sz w:val="17"/>
               </w:rPr>
-              <w:t>Restricción severa: 15 RPM (Error 429)</w:t>
+              <w:t>Máximo 15 preguntas/minuto (Error 429)</w:t>
             </w:r>
           </w:p>
         </w:tc>
@@ -2373,7 +2373,7 @@
                 <w:color w:val="1A365D"/>
                 <w:sz w:val="17"/>
               </w:rPr>
-              <w:t>Excelente concurrencia sin interrupciones</w:t>
+              <w:t>Sin bloqueos ni caídas de cuota</w:t>
             </w:r>
           </w:p>
         </w:tc>
@@ -2398,7 +2398,7 @@
                 <w:color w:val="2D3748"/>
                 <w:sz w:val="17"/>
               </w:rPr>
-              <w:t>Compatibilidad con Unity 3D</w:t>
+              <w:t>Integración con Unity</w:t>
             </w:r>
           </w:p>
         </w:tc>
@@ -2420,7 +2420,7 @@
                 <w:color w:val="2D3748"/>
                 <w:sz w:val="17"/>
               </w:rPr>
-              <w:t>Causa congelamiento (&lt; 12 FPS)</w:t>
+              <w:t>Congelaba la escena (&lt; 12 FPS)</w:t>
             </w:r>
           </w:p>
         </w:tc>
@@ -2442,7 +2442,7 @@
                 <w:color w:val="2D3748"/>
                 <w:sz w:val="17"/>
               </w:rPr>
-              <w:t>Totalmente fluido via REST API</w:t>
+              <w:t>Fluido, pero a veces fallaba el JSON</w:t>
             </w:r>
           </w:p>
         </w:tc>
@@ -2465,7 +2465,7 @@
                 <w:color w:val="1A365D"/>
                 <w:sz w:val="17"/>
               </w:rPr>
-              <w:t>Totalmente fluido e interactivo (60 FPS)</w:t>
+              <w:t>60 FPS estables y JSON perfecto</w:t>
             </w:r>
           </w:p>
         </w:tc>
@@ -2490,7 +2490,7 @@
                 <w:color w:val="2D3748"/>
                 <w:sz w:val="17"/>
               </w:rPr>
-              <w:t>Tolerancia Tipográfica Móvil</w:t>
+              <w:t>Citas y Fuentes</w:t>
             </w:r>
           </w:p>
         </w:tc>
@@ -2512,7 +2512,7 @@
                 <w:color w:val="2D3748"/>
                 <w:sz w:val="17"/>
               </w:rPr>
-              <w:t>Nula (falla ante cualquier typo)</w:t>
+              <w:t>Genéricas / Sin página</w:t>
             </w:r>
           </w:p>
         </w:tc>
@@ -2534,6 +2534,98 @@
                 <w:color w:val="2D3748"/>
                 <w:sz w:val="17"/>
               </w:rPr>
+              <w:t>Mencionaba el libro sin página exacta</w:t>
+            </w:r>
+          </w:p>
+        </w:tc>
+        <w:tc>
+          <w:tcPr>
+            <w:tcW w:type="dxa" w:w="2340"/>
+            <w:shd w:fill="F7FAFC"/>
+            <w:tcMar>
+              <w:top w:w="70" w:type="dxa"/>
+              <w:bottom w:w="70" w:type="dxa"/>
+              <w:left w:w="80" w:type="dxa"/>
+              <w:right w:w="80" w:type="dxa"/>
+            </w:tcMar>
+          </w:tcPr>
+          <w:p>
+            <w:r>
+              <w:rPr>
+                <w:rFonts w:ascii="Calibri" w:hAnsi="Calibri"/>
+                <w:b/>
+                <w:color w:val="1A365D"/>
+                <w:sz w:val="17"/>
+              </w:rPr>
+              <w:t>Exactas: [Fuente X, pág. Y]</w:t>
+            </w:r>
+          </w:p>
+        </w:tc>
+      </w:tr>
+      <w:tr>
+        <w:tc>
+          <w:tcPr>
+            <w:tcW w:type="dxa" w:w="2340"/>
+            <w:shd w:fill="FFFFFF"/>
+            <w:tcMar>
+              <w:top w:w="70" w:type="dxa"/>
+              <w:bottom w:w="70" w:type="dxa"/>
+              <w:left w:w="80" w:type="dxa"/>
+              <w:right w:w="80" w:type="dxa"/>
+            </w:tcMar>
+          </w:tcPr>
+          <w:p>
+            <w:r>
+              <w:rPr>
+                <w:rFonts w:ascii="Calibri" w:hAnsi="Calibri"/>
+                <w:b/>
+                <w:color w:val="2D3748"/>
+                <w:sz w:val="17"/>
+              </w:rPr>
+              <w:t>Tolerancia Tipográfica</w:t>
+            </w:r>
+          </w:p>
+        </w:tc>
+        <w:tc>
+          <w:tcPr>
+            <w:tcW w:type="dxa" w:w="2340"/>
+            <w:shd w:fill="FFFFFF"/>
+            <w:tcMar>
+              <w:top w:w="70" w:type="dxa"/>
+              <w:bottom w:w="70" w:type="dxa"/>
+              <w:left w:w="80" w:type="dxa"/>
+              <w:right w:w="80" w:type="dxa"/>
+            </w:tcMar>
+          </w:tcPr>
+          <w:p>
+            <w:r>
+              <w:rPr>
+                <w:rFonts w:ascii="Calibri" w:hAnsi="Calibri"/>
+                <w:color w:val="2D3748"/>
+                <w:sz w:val="17"/>
+              </w:rPr>
+              <w:t>Nula (falla ante cualquier typo)</w:t>
+            </w:r>
+          </w:p>
+        </w:tc>
+        <w:tc>
+          <w:tcPr>
+            <w:tcW w:type="dxa" w:w="2340"/>
+            <w:shd w:fill="FFFFFF"/>
+            <w:tcMar>
+              <w:top w:w="70" w:type="dxa"/>
+              <w:bottom w:w="70" w:type="dxa"/>
+              <w:left w:w="80" w:type="dxa"/>
+              <w:right w:w="80" w:type="dxa"/>
+            </w:tcMar>
+          </w:tcPr>
+          <w:p>
+            <w:r>
+              <w:rPr>
+                <w:rFonts w:ascii="Calibri" w:hAnsi="Calibri"/>
+                <w:color w:val="2D3748"/>
+                <w:sz w:val="17"/>
+              </w:rPr>
               <w:t>Baja (depende de similitud vectorial)</w:t>
             </w:r>
           </w:p>
@@ -2541,7 +2633,7 @@
         <w:tc>
           <w:tcPr>
             <w:tcW w:type="dxa" w:w="2340"/>
-            <w:shd w:fill="F7FAFC"/>
+            <w:shd w:fill="FFFFFF"/>
             <w:tcMar>
               <w:top w:w="70" w:type="dxa"/>
               <w:bottom w:w="70" w:type="dxa"/>
@@ -2566,7 +2658,7 @@
         <w:tc>
           <w:tcPr>
             <w:tcW w:type="dxa" w:w="2340"/>
-            <w:shd w:fill="FFFFFF"/>
+            <w:shd w:fill="F7FAFC"/>
             <w:tcMar>
               <w:top w:w="70" w:type="dxa"/>
               <w:bottom w:w="70" w:type="dxa"/>
@@ -2582,14 +2674,14 @@
                 <w:color w:val="2D3748"/>
                 <w:sz w:val="17"/>
               </w:rPr>
-              <w:t>Costo Operativo Mensual</w:t>
+              <w:t>Costo Mensual</w:t>
             </w:r>
           </w:p>
         </w:tc>
         <w:tc>
           <w:tcPr>
             <w:tcW w:type="dxa" w:w="2340"/>
-            <w:shd w:fill="FFFFFF"/>
+            <w:shd w:fill="F7FAFC"/>
             <w:tcMar>
               <w:top w:w="70" w:type="dxa"/>
               <w:bottom w:w="70" w:type="dxa"/>
@@ -2604,14 +2696,14 @@
                 <w:color w:val="2D3748"/>
                 <w:sz w:val="17"/>
               </w:rPr>
-              <w:t>Requiere hardware de &gt; $2,500 USD</w:t>
+              <w:t>$0 (pero exigía PC de $2,500 USD)</w:t>
             </w:r>
           </w:p>
         </w:tc>
         <w:tc>
           <w:tcPr>
             <w:tcW w:type="dxa" w:w="2340"/>
-            <w:shd w:fill="FFFFFF"/>
+            <w:shd w:fill="F7FAFC"/>
             <w:tcMar>
               <w:top w:w="70" w:type="dxa"/>
               <w:bottom w:w="70" w:type="dxa"/>
@@ -2626,14 +2718,14 @@
                 <w:color w:val="2D3748"/>
                 <w:sz w:val="17"/>
               </w:rPr>
-              <w:t>$0 USD (con límites de cuota)</w:t>
+              <w:t>$0 (con cuota muy restringida)</w:t>
             </w:r>
           </w:p>
         </w:tc>
         <w:tc>
           <w:tcPr>
             <w:tcW w:type="dxa" w:w="2340"/>
-            <w:shd w:fill="FFFFFF"/>
+            <w:shd w:fill="F7FAFC"/>
             <w:tcMar>
               <w:top w:w="70" w:type="dxa"/>
               <w:bottom w:w="70" w:type="dxa"/>
@@ -2649,7 +2741,7 @@
                 <w:color w:val="1A365D"/>
                 <w:sz w:val="17"/>
               </w:rPr>
-              <w:t>$0 USD (Producción 24/7 permanente)</w:t>
+              <w:t>$0 USD permanente</w:t>
             </w:r>
           </w:p>
         </w:tc>

</xml_diff>

<commit_message>
docs: anadir diagrama de sincronizacion en cadena GitHub + Render y justificacion de persistencia
</commit_message>
<xml_diff>
--- a/Otros/Informe_Justificacion_Tecnica_Gemini_vs_Ollama.docx
+++ b/Otros/Informe_Justificacion_Tecnica_Gemini_vs_Ollama.docx
@@ -3781,6 +3781,96 @@
         <w:t>El proceso fue diseñado para que los docentes e investigadores del Laboratorio NeuroK no requieran conocimientos de programación ni uso de terminales de comandos: simplemente ingresan al panel web administrativo de Atena con su PIN de seguridad ('1234'), arrastran el nuevo archivo PDF o Word en la sección de Base de Conocimientos (donde el motor lo fragmenta y vectoriza automáticamente de forma inmediata), y presionan el botón '🚀 Publicar Cambios a la Nube'. El sistema ejecuta la sincronización de manera transparente y desatendida, provocando que Render actualice la imagen y el servicio en aproximadamente 2 minutos. Así, la aplicación móvil de Unity de todos los estudiantes queda sincronizada con la nueva literatura sin costo, sin caídas y sin que el personal del laboratorio deba escribir una sola línea de código.</w:t>
       </w:r>
     </w:p>
+    <w:tbl>
+      <w:tblPr>
+        <w:tblW w:type="auto" w:w="0"/>
+        <w:jc w:val="center"/>
+        <w:tblLook w:firstColumn="1" w:firstRow="1" w:lastColumn="0" w:lastRow="0" w:noHBand="0" w:noVBand="1" w:val="04A0"/>
+      </w:tblPr>
+      <w:tblGrid>
+        <w:gridCol w:w="9360"/>
+      </w:tblGrid>
+      <w:tr>
+        <w:tc>
+          <w:tcPr>
+            <w:tcW w:type="dxa" w:w="9360"/>
+            <w:shd w:fill="EBF8FF"/>
+            <w:tcMar>
+              <w:top w:w="140" w:type="dxa"/>
+              <w:bottom w:w="140" w:type="dxa"/>
+              <w:left w:w="200" w:type="dxa"/>
+              <w:right w:w="200" w:type="dxa"/>
+            </w:tcMar>
+            <w:tcBorders>
+              <w:left w:val="single" w:sz="36" w:space="0" w:color="3182CE"/>
+              <w:top w:val="none"/>
+              <w:right w:val="none"/>
+              <w:bottom w:val="none"/>
+            </w:tcBorders>
+          </w:tcPr>
+          <w:p>
+            <w:pPr>
+              <w:spacing w:after="80"/>
+            </w:pPr>
+            <w:r>
+              <w:rPr>
+                <w:rFonts w:ascii="Arial" w:hAnsi="Arial"/>
+                <w:b/>
+                <w:color w:val="2B6CB0"/>
+                <w:sz w:val="21"/>
+              </w:rPr>
+              <w:t>💡 ARQUITECTURA DE SINCRONIZACIÓN EN CADENA (GITHUB + RENDER)</w:t>
+              <w:br/>
+            </w:r>
+            <w:r>
+              <w:rPr>
+                <w:rFonts w:ascii="Calibri" w:hAnsi="Calibri"/>
+                <w:i/>
+                <w:color w:val="2D3748"/>
+                <w:sz w:val="20"/>
+              </w:rPr>
+              <w:t>[1. Laboratorista presiona el botón en Streamlit]</w:t>
+              <w:br/>
+              <w:t xml:space="preserve">                 │</w:t>
+              <w:br/>
+              <w:t xml:space="preserve">                 ▼</w:t>
+              <w:br/>
+              <w:t>[2. Se actualiza en GITHUB]</w:t>
+              <w:br/>
+              <w:t xml:space="preserve">  • Sube el PDF a la carpeta Docs/</w:t>
+              <w:br/>
+              <w:t xml:space="preserve">  • Sube los nuevos vectores a chroma_neuro_db/</w:t>
+              <w:br/>
+              <w:t xml:space="preserve">  • Queda guardado y respaldado para siempre en la nube de GitHub</w:t>
+              <w:br/>
+              <w:t xml:space="preserve">                 │</w:t>
+              <w:br/>
+              <w:t xml:space="preserve">                 ▼ (Notificación automática por Webhook)</w:t>
+              <w:br/>
+              <w:t>[3. Se actualiza en RENDER]</w:t>
+              <w:br/>
+              <w:t xml:space="preserve">  • Render detecta el cambio en GitHub</w:t>
+              <w:br/>
+              <w:t xml:space="preserve">  • Reconstruye el contenedor en ~2 minutos</w:t>
+              <w:br/>
+              <w:t xml:space="preserve">  • Pone los nuevos libros al servicio de Unity y los estudiantes</w:t>
+              <w:br/>
+              <w:br/>
+              <w:t>¿Por qué se actualiza en ambos (GitHub y Render)?</w:t>
+              <w:br/>
+              <w:t>1. Persistencia y Respaldo Permanente (GitHub): Los servidores en capa gratuita de Render tienen disco efímero (se borran tras 15 min de inactividad al dormir). Al guardarse en GitHub, el repositorio actúa como bóveda de respaldo permanente bajo soberanía institucional.</w:t>
+              <w:br/>
+              <w:t>2. Despliegue Continuo Automático (Render): Render está enlazado a GitHub mediante Webhooks. Al recibir los nuevos libros, notifica a Render para compilar la nueva imagen Docker y disponibilizar el conocimiento a Unity sin tiempo de inactividad.</w:t>
+            </w:r>
+          </w:p>
+        </w:tc>
+      </w:tr>
+    </w:tbl>
+    <w:p>
+      <w:pPr>
+        <w:spacing w:after="120"/>
+      </w:pPr>
+    </w:p>
     <w:p>
       <w:pPr>
         <w:keepNext/>

</xml_diff>